<commit_message>
feat(register): Titel, Kap. VII „fluche“, alphabet. Tabellen, Bilder rechts, Bildnachweis
- Bandtitel: „Antike safaitische Inschriften / nomadischer Beduinen Nordarabiens
  · 1. Jh. v. Chr. – 4. Jh. n. Chr.“; „Wer dies liest, lebe lang“ als Untertitel.
- Kapitel VII heißt jetzt „fluche“ (statt „verfluche“); Nachwort/Doku angepasst.
- Corpus-Siglen- und Fundort-Tabelle alphabetisch sortiert; Einleitungstext
  über der Fundort-Tabelle entfernt.
- Abbildungen kleiner (~4,6 cm) und rechts neben dem Gedicht schwebend
  (DrawingML-Anchor, wrapSquare) statt inline darunter.
- Bildnachweis (Sigle, Motiv, OCIANA-Bild-ID, Quelle) am Ende des Nachworts.

Co-Authored-By: Claude Opus 4.8 <noreply@anthropic.com>
Claude-Session: https://claude.ai/code/session_01WJ6p9HdvKuJ9ea1tbSE1cy
</commit_message>
<xml_diff>
--- a/safaitic-research/Poetics/register/wer_dies_liest_register_v4.docx
+++ b/safaitic-research/Poetics/register/wer_dies_liest_register_v4.docx
@@ -13,7 +13,7 @@
           <w:sz w:val="52"/>
           <w:szCs w:val="52"/>
         </w:rPr>
-        <w:t xml:space="preserve">Wer dies liest, lebe lang</w:t>
+        <w:t xml:space="preserve">Antike safaitische Inschriften</w:t>
       </w:r>
     </w:p>
     <w:p>
@@ -23,10 +23,11 @@
       <w:r>
         <w:rPr>
           <w:rFonts w:ascii="Georgia" w:cs="Georgia" w:eastAsia="Georgia" w:hAnsi="Georgia"/>
-          <w:sz w:val="26"/>
-          <w:szCs w:val="26"/>
-        </w:rPr>
-        <w:t xml:space="preserve">Safaitische Inschriften, nachgedichtet</w:t>
+          <w:color w:val="7A5C3E"/>
+          <w:sz w:val="22"/>
+          <w:szCs w:val="22"/>
+        </w:rPr>
+        <w:t xml:space="preserve">nomadischer Beduinen Nordarabiens · 1. Jh. v. Chr. – 4. Jh. n. Chr.</w:t>
       </w:r>
     </w:p>
     <w:p>
@@ -36,11 +37,10 @@
       <w:r>
         <w:rPr>
           <w:rFonts w:ascii="Georgia" w:cs="Georgia" w:eastAsia="Georgia" w:hAnsi="Georgia"/>
-          <w:color w:val="7A5C3E"/>
           <w:sz w:val="20"/>
           <w:szCs w:val="20"/>
         </w:rPr>
-        <w:t xml:space="preserve">Aus der nordarabischen Steppe · 1. Jh. v. – 4. Jh. n. Chr.</w:t>
+        <w:t xml:space="preserve">»Wer dies liest, lebe lang« — in deutscher Nachdichtung</w:t>
       </w:r>
     </w:p>
     <w:p>
@@ -660,37 +660,20 @@
         <w:spacing w:before="260" w:after="40"/>
       </w:pPr>
       <w:r>
-        <w:rPr>
-          <w:rFonts w:ascii="Georgia" w:cs="Georgia" w:eastAsia="Georgia" w:hAnsi="Georgia"/>
-          <w:color w:val="7A5C3E"/>
-          <w:sz w:val="16"/>
-          <w:szCs w:val="16"/>
-        </w:rPr>
-        <w:t xml:space="preserve">Fundort unbekannt · HYGQ 24</w:t>
-      </w:r>
-    </w:p>
-    <w:p>
-      <w:pPr>
-        <w:spacing w:after="40"/>
-      </w:pPr>
-      <w:r>
-        <w:rPr>
-          <w:rFonts w:ascii="Georgia" w:cs="Georgia" w:eastAsia="Georgia" w:hAnsi="Georgia"/>
-          <w:sz w:val="22"/>
-          <w:szCs w:val="22"/>
-        </w:rPr>
-        <w:t xml:space="preserve">Der Löwe.</w:t>
-      </w:r>
-    </w:p>
-    <w:p>
-      <w:pPr>
-        <w:spacing w:before="80" w:after="20"/>
-      </w:pPr>
-      <w:r>
         <w:drawing>
-          <wp:inline distT="0" distB="0" distL="0" distR="0">
-            <wp:extent cx="3060000" cy="3037050"/>
+          <wp:anchor distT="0" distB="0" distL="114300" distR="114300" simplePos="0" relativeHeight="251667241" behindDoc="0" locked="0" layoutInCell="1" allowOverlap="1">
+            <wp:simplePos x="0" y="0"/>
+            <wp:positionH relativeFrom="margin">
+              <wp:align>right</wp:align>
+            </wp:positionH>
+            <wp:positionV relativeFrom="paragraph">
+              <wp:posOffset>0</wp:posOffset>
+            </wp:positionV>
+            <wp:extent cx="1650000" cy="1637625"/>
+            <wp:effectExtent l="0" t="0" r="0" b="0"/>
+            <wp:wrapSquare wrapText="left"/>
             <wp:docPr id="9001" name="rockart9001"/>
+            <wp:cNvGraphicFramePr/>
             <a:graphic xmlns:a="http://schemas.openxmlformats.org/drawingml/2006/main">
               <a:graphicData uri="http://schemas.openxmlformats.org/drawingml/2006/picture">
                 <pic:pic xmlns:pic="http://schemas.openxmlformats.org/drawingml/2006/picture">
@@ -707,7 +690,7 @@
                   <pic:spPr>
                     <a:xfrm>
                       <a:off x="0" y="0"/>
-                      <a:ext cx="3060000" cy="3037050"/>
+                      <a:ext cx="1650000" cy="1637625"/>
                     </a:xfrm>
                     <a:prstGeom prst="rect">
                       <a:avLst/>
@@ -716,61 +699,51 @@
                 </pic:pic>
               </a:graphicData>
             </a:graphic>
-          </wp:inline>
+          </wp:anchor>
         </w:drawing>
       </w:r>
-    </w:p>
-    <w:p>
-      <w:pPr>
-        <w:spacing w:after="120"/>
-      </w:pPr>
-      <w:r>
-        <w:rPr>
-          <w:rFonts w:ascii="Georgia" w:cs="Georgia" w:eastAsia="Georgia" w:hAnsi="Georgia"/>
-          <w:i/>
-          <w:color w:val="666666"/>
-          <w:sz w:val="16"/>
-          <w:szCs w:val="16"/>
-        </w:rPr>
-        <w:t xml:space="preserve">Auf dem Stein: Zeichnung eines Löwen.</w:t>
-      </w:r>
-    </w:p>
-    <w:p>
-      <w:pPr>
-        <w:spacing w:before="260" w:after="40"/>
-      </w:pPr>
-      <w:r>
-        <w:rPr>
-          <w:rFonts w:ascii="Georgia" w:cs="Georgia" w:eastAsia="Georgia" w:hAnsi="Georgia"/>
-          <w:color w:val="7A5C3E"/>
-          <w:sz w:val="16"/>
-          <w:szCs w:val="16"/>
-        </w:rPr>
-        <w:t xml:space="preserve">Al-Mafraq · KRS 1341</w:t>
-      </w:r>
-    </w:p>
-    <w:p>
-      <w:pPr>
-        <w:spacing w:after="40"/>
-      </w:pPr>
-      <w:r>
-        <w:rPr>
-          <w:rFonts w:ascii="Georgia" w:cs="Georgia" w:eastAsia="Georgia" w:hAnsi="Georgia"/>
-          <w:sz w:val="22"/>
-          <w:szCs w:val="22"/>
-        </w:rPr>
-        <w:t xml:space="preserve">Die Zeichnung des Löwen.</w:t>
-      </w:r>
-    </w:p>
-    <w:p>
-      <w:pPr>
-        <w:spacing w:before="80" w:after="20"/>
+      <w:r>
+        <w:rPr>
+          <w:rFonts w:ascii="Georgia" w:cs="Georgia" w:eastAsia="Georgia" w:hAnsi="Georgia"/>
+          <w:color w:val="7A5C3E"/>
+          <w:sz w:val="16"/>
+          <w:szCs w:val="16"/>
+        </w:rPr>
+        <w:t xml:space="preserve">Fundort unbekannt · HYGQ 24</w:t>
+      </w:r>
+    </w:p>
+    <w:p>
+      <w:pPr>
+        <w:spacing w:after="40"/>
+      </w:pPr>
+      <w:r>
+        <w:rPr>
+          <w:rFonts w:ascii="Georgia" w:cs="Georgia" w:eastAsia="Georgia" w:hAnsi="Georgia"/>
+          <w:sz w:val="22"/>
+          <w:szCs w:val="22"/>
+        </w:rPr>
+        <w:t xml:space="preserve">Der Löwe.</w:t>
+      </w:r>
+    </w:p>
+    <w:p>
+      <w:pPr>
+        <w:spacing w:before="260" w:after="40"/>
       </w:pPr>
       <w:r>
         <w:drawing>
-          <wp:inline distT="0" distB="0" distL="0" distR="0">
-            <wp:extent cx="3060000" cy="2325600"/>
+          <wp:anchor distT="0" distB="0" distL="114300" distR="114300" simplePos="0" relativeHeight="251667242" behindDoc="0" locked="0" layoutInCell="1" allowOverlap="1">
+            <wp:simplePos x="0" y="0"/>
+            <wp:positionH relativeFrom="margin">
+              <wp:align>right</wp:align>
+            </wp:positionH>
+            <wp:positionV relativeFrom="paragraph">
+              <wp:posOffset>0</wp:posOffset>
+            </wp:positionV>
+            <wp:extent cx="1650000" cy="1254000"/>
+            <wp:effectExtent l="0" t="0" r="0" b="0"/>
+            <wp:wrapSquare wrapText="left"/>
             <wp:docPr id="9002" name="rockart9002"/>
+            <wp:cNvGraphicFramePr/>
             <a:graphic xmlns:a="http://schemas.openxmlformats.org/drawingml/2006/main">
               <a:graphicData uri="http://schemas.openxmlformats.org/drawingml/2006/picture">
                 <pic:pic xmlns:pic="http://schemas.openxmlformats.org/drawingml/2006/picture">
@@ -787,7 +760,7 @@
                   <pic:spPr>
                     <a:xfrm>
                       <a:off x="0" y="0"/>
-                      <a:ext cx="3060000" cy="2325600"/>
+                      <a:ext cx="1650000" cy="1254000"/>
                     </a:xfrm>
                     <a:prstGeom prst="rect">
                       <a:avLst/>
@@ -796,23 +769,30 @@
                 </pic:pic>
               </a:graphicData>
             </a:graphic>
-          </wp:inline>
+          </wp:anchor>
         </w:drawing>
       </w:r>
-    </w:p>
-    <w:p>
-      <w:pPr>
-        <w:spacing w:after="120"/>
-      </w:pPr>
-      <w:r>
-        <w:rPr>
-          <w:rFonts w:ascii="Georgia" w:cs="Georgia" w:eastAsia="Georgia" w:hAnsi="Georgia"/>
-          <w:i/>
-          <w:color w:val="666666"/>
-          <w:sz w:val="16"/>
-          <w:szCs w:val="16"/>
-        </w:rPr>
-        <w:t xml:space="preserve">Auf dem Stein: Zeichnung eines Löwen.</w:t>
+      <w:r>
+        <w:rPr>
+          <w:rFonts w:ascii="Georgia" w:cs="Georgia" w:eastAsia="Georgia" w:hAnsi="Georgia"/>
+          <w:color w:val="7A5C3E"/>
+          <w:sz w:val="16"/>
+          <w:szCs w:val="16"/>
+        </w:rPr>
+        <w:t xml:space="preserve">Al-Mafraq · KRS 1341</w:t>
+      </w:r>
+    </w:p>
+    <w:p>
+      <w:pPr>
+        <w:spacing w:after="40"/>
+      </w:pPr>
+      <w:r>
+        <w:rPr>
+          <w:rFonts w:ascii="Georgia" w:cs="Georgia" w:eastAsia="Georgia" w:hAnsi="Georgia"/>
+          <w:sz w:val="22"/>
+          <w:szCs w:val="22"/>
+        </w:rPr>
+        <w:t xml:space="preserve">Die Zeichnung des Löwen.</w:t>
       </w:r>
     </w:p>
     <w:p>
@@ -1613,76 +1593,20 @@
         <w:spacing w:before="260" w:after="40"/>
       </w:pPr>
       <w:r>
-        <w:rPr>
-          <w:rFonts w:ascii="Georgia" w:cs="Georgia" w:eastAsia="Georgia" w:hAnsi="Georgia"/>
-          <w:color w:val="7A5C3E"/>
-          <w:sz w:val="16"/>
-          <w:szCs w:val="16"/>
-        </w:rPr>
-        <w:t xml:space="preserve">Al-Mafraq · KRS 3051</w:t>
-      </w:r>
-    </w:p>
-    <w:p>
-      <w:pPr>
-        <w:spacing w:after="40"/>
-      </w:pPr>
-      <w:r>
-        <w:rPr>
-          <w:rFonts w:ascii="Georgia" w:cs="Georgia" w:eastAsia="Georgia" w:hAnsi="Georgia"/>
-          <w:sz w:val="22"/>
-          <w:szCs w:val="22"/>
-        </w:rPr>
-        <w:t xml:space="preserve">Die junge Kamelstute.</w:t>
-      </w:r>
-    </w:p>
-    <w:p>
-      <w:pPr>
-        <w:spacing w:after="40"/>
-      </w:pPr>
-      <w:r>
-        <w:rPr>
-          <w:rFonts w:ascii="Georgia" w:cs="Georgia" w:eastAsia="Georgia" w:hAnsi="Georgia"/>
-          <w:sz w:val="22"/>
-          <w:szCs w:val="22"/>
-        </w:rPr>
-        <w:t xml:space="preserve">Er zog hinaus ins weite, offene Land</w:t>
-      </w:r>
-    </w:p>
-    <w:p>
-      <w:pPr>
-        <w:spacing w:after="40"/>
-      </w:pPr>
-      <w:r>
-        <w:rPr>
-          <w:rFonts w:ascii="Georgia" w:cs="Georgia" w:eastAsia="Georgia" w:hAnsi="Georgia"/>
-          <w:sz w:val="22"/>
-          <w:szCs w:val="22"/>
-        </w:rPr>
-        <w:t xml:space="preserve">und verzweifelte</w:t>
-      </w:r>
-    </w:p>
-    <w:p>
-      <w:pPr>
-        <w:spacing w:after="40"/>
-      </w:pPr>
-      <w:r>
-        <w:rPr>
-          <w:rFonts w:ascii="Georgia" w:cs="Georgia" w:eastAsia="Georgia" w:hAnsi="Georgia"/>
-          <w:sz w:val="22"/>
-          <w:szCs w:val="22"/>
-        </w:rPr>
-        <w:t xml:space="preserve">auf der Lauer nach der Raubschar.</w:t>
-      </w:r>
-    </w:p>
-    <w:p>
-      <w:pPr>
-        <w:spacing w:before="80" w:after="20"/>
-      </w:pPr>
-      <w:r>
         <w:drawing>
-          <wp:inline distT="0" distB="0" distL="0" distR="0">
-            <wp:extent cx="3060000" cy="1545300"/>
+          <wp:anchor distT="0" distB="0" distL="114300" distR="114300" simplePos="0" relativeHeight="251667243" behindDoc="0" locked="0" layoutInCell="1" allowOverlap="1">
+            <wp:simplePos x="0" y="0"/>
+            <wp:positionH relativeFrom="margin">
+              <wp:align>right</wp:align>
+            </wp:positionH>
+            <wp:positionV relativeFrom="paragraph">
+              <wp:posOffset>0</wp:posOffset>
+            </wp:positionV>
+            <wp:extent cx="1650000" cy="833250"/>
+            <wp:effectExtent l="0" t="0" r="0" b="0"/>
+            <wp:wrapSquare wrapText="left"/>
             <wp:docPr id="9003" name="rockart9003"/>
+            <wp:cNvGraphicFramePr/>
             <a:graphic xmlns:a="http://schemas.openxmlformats.org/drawingml/2006/main">
               <a:graphicData uri="http://schemas.openxmlformats.org/drawingml/2006/picture">
                 <pic:pic xmlns:pic="http://schemas.openxmlformats.org/drawingml/2006/picture">
@@ -1699,7 +1623,7 @@
                   <pic:spPr>
                     <a:xfrm>
                       <a:off x="0" y="0"/>
-                      <a:ext cx="3060000" cy="1545300"/>
+                      <a:ext cx="1650000" cy="833250"/>
                     </a:xfrm>
                     <a:prstGeom prst="rect">
                       <a:avLst/>
@@ -1708,23 +1632,69 @@
                 </pic:pic>
               </a:graphicData>
             </a:graphic>
-          </wp:inline>
+          </wp:anchor>
         </w:drawing>
       </w:r>
-    </w:p>
-    <w:p>
-      <w:pPr>
-        <w:spacing w:after="120"/>
-      </w:pPr>
-      <w:r>
-        <w:rPr>
-          <w:rFonts w:ascii="Georgia" w:cs="Georgia" w:eastAsia="Georgia" w:hAnsi="Georgia"/>
-          <w:i/>
-          <w:color w:val="666666"/>
-          <w:sz w:val="16"/>
-          <w:szCs w:val="16"/>
-        </w:rPr>
-        <w:t xml:space="preserve">Auf dem Stein: Zeichnung einer jungen Kamelstute.</w:t>
+      <w:r>
+        <w:rPr>
+          <w:rFonts w:ascii="Georgia" w:cs="Georgia" w:eastAsia="Georgia" w:hAnsi="Georgia"/>
+          <w:color w:val="7A5C3E"/>
+          <w:sz w:val="16"/>
+          <w:szCs w:val="16"/>
+        </w:rPr>
+        <w:t xml:space="preserve">Al-Mafraq · KRS 3051</w:t>
+      </w:r>
+    </w:p>
+    <w:p>
+      <w:pPr>
+        <w:spacing w:after="40"/>
+      </w:pPr>
+      <w:r>
+        <w:rPr>
+          <w:rFonts w:ascii="Georgia" w:cs="Georgia" w:eastAsia="Georgia" w:hAnsi="Georgia"/>
+          <w:sz w:val="22"/>
+          <w:szCs w:val="22"/>
+        </w:rPr>
+        <w:t xml:space="preserve">Die junge Kamelstute.</w:t>
+      </w:r>
+    </w:p>
+    <w:p>
+      <w:pPr>
+        <w:spacing w:after="40"/>
+      </w:pPr>
+      <w:r>
+        <w:rPr>
+          <w:rFonts w:ascii="Georgia" w:cs="Georgia" w:eastAsia="Georgia" w:hAnsi="Georgia"/>
+          <w:sz w:val="22"/>
+          <w:szCs w:val="22"/>
+        </w:rPr>
+        <w:t xml:space="preserve">Er zog hinaus ins weite, offene Land</w:t>
+      </w:r>
+    </w:p>
+    <w:p>
+      <w:pPr>
+        <w:spacing w:after="40"/>
+      </w:pPr>
+      <w:r>
+        <w:rPr>
+          <w:rFonts w:ascii="Georgia" w:cs="Georgia" w:eastAsia="Georgia" w:hAnsi="Georgia"/>
+          <w:sz w:val="22"/>
+          <w:szCs w:val="22"/>
+        </w:rPr>
+        <w:t xml:space="preserve">und verzweifelte</w:t>
+      </w:r>
+    </w:p>
+    <w:p>
+      <w:pPr>
+        <w:spacing w:after="40"/>
+      </w:pPr>
+      <w:r>
+        <w:rPr>
+          <w:rFonts w:ascii="Georgia" w:cs="Georgia" w:eastAsia="Georgia" w:hAnsi="Georgia"/>
+          <w:sz w:val="22"/>
+          <w:szCs w:val="22"/>
+        </w:rPr>
+        <w:t xml:space="preserve">auf der Lauer nach der Raubschar.</w:t>
       </w:r>
     </w:p>
     <w:p>
@@ -5072,7 +5042,7 @@
           <w:sz w:val="30"/>
           <w:szCs w:val="30"/>
         </w:rPr>
-        <w:t xml:space="preserve">verfluche</w:t>
+        <w:t xml:space="preserve">fluche</w:t>
       </w:r>
     </w:p>
     <w:p>
@@ -5804,76 +5774,20 @@
         <w:spacing w:before="260" w:after="40"/>
       </w:pPr>
       <w:r>
-        <w:rPr>
-          <w:rFonts w:ascii="Georgia" w:cs="Georgia" w:eastAsia="Georgia" w:hAnsi="Georgia"/>
-          <w:color w:val="7A5C3E"/>
-          <w:sz w:val="16"/>
-          <w:szCs w:val="16"/>
-        </w:rPr>
-        <w:t xml:space="preserve">Hani · HCH 85</w:t>
-      </w:r>
-    </w:p>
-    <w:p>
-      <w:pPr>
-        <w:spacing w:after="40"/>
-      </w:pPr>
-      <w:r>
-        <w:rPr>
-          <w:rFonts w:ascii="Georgia" w:cs="Georgia" w:eastAsia="Georgia" w:hAnsi="Georgia"/>
-          <w:sz w:val="22"/>
-          <w:szCs w:val="22"/>
-        </w:rPr>
-        <w:t xml:space="preserve">Er trauerte um Hnʾ</w:t>
-      </w:r>
-    </w:p>
-    <w:p>
-      <w:pPr>
-        <w:spacing w:after="40"/>
-      </w:pPr>
-      <w:r>
-        <w:rPr>
-          <w:rFonts w:ascii="Georgia" w:cs="Georgia" w:eastAsia="Georgia" w:hAnsi="Georgia"/>
-          <w:sz w:val="22"/>
-          <w:szCs w:val="22"/>
-        </w:rPr>
-        <w:t xml:space="preserve">und um Gls¹.</w:t>
-      </w:r>
-    </w:p>
-    <w:p>
-      <w:pPr>
-        <w:spacing w:after="40"/>
-      </w:pPr>
-      <w:r>
-        <w:rPr>
-          <w:rFonts w:ascii="Georgia" w:cs="Georgia" w:eastAsia="Georgia" w:hAnsi="Georgia"/>
-          <w:sz w:val="22"/>
-          <w:szCs w:val="22"/>
-        </w:rPr>
-        <w:t xml:space="preserve">Allat und Duschara —</w:t>
-      </w:r>
-    </w:p>
-    <w:p>
-      <w:pPr>
-        <w:spacing w:after="40"/>
-      </w:pPr>
-      <w:r>
-        <w:rPr>
-          <w:rFonts w:ascii="Georgia" w:cs="Georgia" w:eastAsia="Georgia" w:hAnsi="Georgia"/>
-          <w:sz w:val="22"/>
-          <w:szCs w:val="22"/>
-        </w:rPr>
-        <w:t xml:space="preserve">Blindheit dem, der dies auskratzt.</w:t>
-      </w:r>
-    </w:p>
-    <w:p>
-      <w:pPr>
-        <w:spacing w:before="80" w:after="20"/>
-      </w:pPr>
-      <w:r>
         <w:drawing>
-          <wp:inline distT="0" distB="0" distL="0" distR="0">
-            <wp:extent cx="3060000" cy="1644750"/>
+          <wp:anchor distT="0" distB="0" distL="114300" distR="114300" simplePos="0" relativeHeight="251667244" behindDoc="0" locked="0" layoutInCell="1" allowOverlap="1">
+            <wp:simplePos x="0" y="0"/>
+            <wp:positionH relativeFrom="margin">
+              <wp:align>right</wp:align>
+            </wp:positionH>
+            <wp:positionV relativeFrom="paragraph">
+              <wp:posOffset>0</wp:posOffset>
+            </wp:positionV>
+            <wp:extent cx="1650000" cy="886875"/>
+            <wp:effectExtent l="0" t="0" r="0" b="0"/>
+            <wp:wrapSquare wrapText="left"/>
             <wp:docPr id="9004" name="rockart9004"/>
+            <wp:cNvGraphicFramePr/>
             <a:graphic xmlns:a="http://schemas.openxmlformats.org/drawingml/2006/main">
               <a:graphicData uri="http://schemas.openxmlformats.org/drawingml/2006/picture">
                 <pic:pic xmlns:pic="http://schemas.openxmlformats.org/drawingml/2006/picture">
@@ -5890,7 +5804,7 @@
                   <pic:spPr>
                     <a:xfrm>
                       <a:off x="0" y="0"/>
-                      <a:ext cx="3060000" cy="1644750"/>
+                      <a:ext cx="1650000" cy="886875"/>
                     </a:xfrm>
                     <a:prstGeom prst="rect">
                       <a:avLst/>
@@ -5899,87 +5813,90 @@
                 </pic:pic>
               </a:graphicData>
             </a:graphic>
-          </wp:inline>
+          </wp:anchor>
         </w:drawing>
       </w:r>
-    </w:p>
-    <w:p>
-      <w:pPr>
-        <w:spacing w:after="120"/>
-      </w:pPr>
-      <w:r>
-        <w:rPr>
-          <w:rFonts w:ascii="Georgia" w:cs="Georgia" w:eastAsia="Georgia" w:hAnsi="Georgia"/>
-          <w:i/>
-          <w:color w:val="666666"/>
-          <w:sz w:val="16"/>
-          <w:szCs w:val="16"/>
-        </w:rPr>
-        <w:t xml:space="preserve">Auf dem Stein: zwei Zeichnungen; die Inschrift in einer Kartusche.</w:t>
-      </w:r>
-    </w:p>
-    <w:p>
-      <w:pPr>
-        <w:spacing w:before="260" w:after="40"/>
-      </w:pPr>
-      <w:r>
-        <w:rPr>
-          <w:rFonts w:ascii="Georgia" w:cs="Georgia" w:eastAsia="Georgia" w:hAnsi="Georgia"/>
-          <w:color w:val="7A5C3E"/>
-          <w:sz w:val="16"/>
-          <w:szCs w:val="16"/>
-        </w:rPr>
-        <w:t xml:space="preserve">Rif Dimašq · C 286</w:t>
-      </w:r>
-    </w:p>
-    <w:p>
-      <w:pPr>
-        <w:spacing w:after="40"/>
-      </w:pPr>
-      <w:r>
-        <w:rPr>
-          <w:rFonts w:ascii="Georgia" w:cs="Georgia" w:eastAsia="Georgia" w:hAnsi="Georgia"/>
-          <w:sz w:val="22"/>
-          <w:szCs w:val="22"/>
-        </w:rPr>
-        <w:t xml:space="preserve">Rudā —</w:t>
-      </w:r>
-    </w:p>
-    <w:p>
-      <w:pPr>
-        <w:spacing w:after="40"/>
-      </w:pPr>
-      <w:r>
-        <w:rPr>
-          <w:rFonts w:ascii="Georgia" w:cs="Georgia" w:eastAsia="Georgia" w:hAnsi="Georgia"/>
-          <w:sz w:val="22"/>
-          <w:szCs w:val="22"/>
-        </w:rPr>
-        <w:t xml:space="preserve">wer dies austilgt,</w:t>
-      </w:r>
-    </w:p>
-    <w:p>
-      <w:pPr>
-        <w:spacing w:after="40"/>
-      </w:pPr>
-      <w:r>
-        <w:rPr>
-          <w:rFonts w:ascii="Georgia" w:cs="Georgia" w:eastAsia="Georgia" w:hAnsi="Georgia"/>
-          <w:sz w:val="22"/>
-          <w:szCs w:val="22"/>
-        </w:rPr>
-        <w:t xml:space="preserve">erblinde.</w:t>
-      </w:r>
-    </w:p>
-    <w:p>
-      <w:pPr>
-        <w:spacing w:before="80" w:after="20"/>
+      <w:r>
+        <w:rPr>
+          <w:rFonts w:ascii="Georgia" w:cs="Georgia" w:eastAsia="Georgia" w:hAnsi="Georgia"/>
+          <w:color w:val="7A5C3E"/>
+          <w:sz w:val="16"/>
+          <w:szCs w:val="16"/>
+        </w:rPr>
+        <w:t xml:space="preserve">Hani · HCH 85</w:t>
+      </w:r>
+    </w:p>
+    <w:p>
+      <w:pPr>
+        <w:spacing w:after="40"/>
+      </w:pPr>
+      <w:r>
+        <w:rPr>
+          <w:rFonts w:ascii="Georgia" w:cs="Georgia" w:eastAsia="Georgia" w:hAnsi="Georgia"/>
+          <w:sz w:val="22"/>
+          <w:szCs w:val="22"/>
+        </w:rPr>
+        <w:t xml:space="preserve">Er trauerte um Hnʾ</w:t>
+      </w:r>
+    </w:p>
+    <w:p>
+      <w:pPr>
+        <w:spacing w:after="40"/>
+      </w:pPr>
+      <w:r>
+        <w:rPr>
+          <w:rFonts w:ascii="Georgia" w:cs="Georgia" w:eastAsia="Georgia" w:hAnsi="Georgia"/>
+          <w:sz w:val="22"/>
+          <w:szCs w:val="22"/>
+        </w:rPr>
+        <w:t xml:space="preserve">und um Gls¹.</w:t>
+      </w:r>
+    </w:p>
+    <w:p>
+      <w:pPr>
+        <w:spacing w:after="40"/>
+      </w:pPr>
+      <w:r>
+        <w:rPr>
+          <w:rFonts w:ascii="Georgia" w:cs="Georgia" w:eastAsia="Georgia" w:hAnsi="Georgia"/>
+          <w:sz w:val="22"/>
+          <w:szCs w:val="22"/>
+        </w:rPr>
+        <w:t xml:space="preserve">Allat und Duschara —</w:t>
+      </w:r>
+    </w:p>
+    <w:p>
+      <w:pPr>
+        <w:spacing w:after="40"/>
+      </w:pPr>
+      <w:r>
+        <w:rPr>
+          <w:rFonts w:ascii="Georgia" w:cs="Georgia" w:eastAsia="Georgia" w:hAnsi="Georgia"/>
+          <w:sz w:val="22"/>
+          <w:szCs w:val="22"/>
+        </w:rPr>
+        <w:t xml:space="preserve">Blindheit dem, der dies auskratzt.</w:t>
+      </w:r>
+    </w:p>
+    <w:p>
+      <w:pPr>
+        <w:spacing w:before="260" w:after="40"/>
       </w:pPr>
       <w:r>
         <w:drawing>
-          <wp:inline distT="0" distB="0" distL="0" distR="0">
-            <wp:extent cx="2419350" cy="3810000"/>
+          <wp:anchor distT="0" distB="0" distL="114300" distR="114300" simplePos="0" relativeHeight="251667245" behindDoc="0" locked="0" layoutInCell="1" allowOverlap="1">
+            <wp:simplePos x="0" y="0"/>
+            <wp:positionH relativeFrom="margin">
+              <wp:align>right</wp:align>
+            </wp:positionH>
+            <wp:positionV relativeFrom="paragraph">
+              <wp:posOffset>0</wp:posOffset>
+            </wp:positionV>
+            <wp:extent cx="1650000" cy="2598425"/>
+            <wp:effectExtent l="0" t="0" r="0" b="0"/>
+            <wp:wrapSquare wrapText="left"/>
             <wp:docPr id="9005" name="rockart9005"/>
+            <wp:cNvGraphicFramePr/>
             <a:graphic xmlns:a="http://schemas.openxmlformats.org/drawingml/2006/main">
               <a:graphicData uri="http://schemas.openxmlformats.org/drawingml/2006/picture">
                 <pic:pic xmlns:pic="http://schemas.openxmlformats.org/drawingml/2006/picture">
@@ -5996,7 +5913,7 @@
                   <pic:spPr>
                     <a:xfrm>
                       <a:off x="0" y="0"/>
-                      <a:ext cx="2419350" cy="3810000"/>
+                      <a:ext cx="1650000" cy="2598425"/>
                     </a:xfrm>
                     <a:prstGeom prst="rect">
                       <a:avLst/>
@@ -6005,100 +5922,77 @@
                 </pic:pic>
               </a:graphicData>
             </a:graphic>
-          </wp:inline>
+          </wp:anchor>
         </w:drawing>
       </w:r>
-    </w:p>
-    <w:p>
-      <w:pPr>
-        <w:spacing w:after="120"/>
-      </w:pPr>
-      <w:r>
-        <w:rPr>
-          <w:rFonts w:ascii="Georgia" w:cs="Georgia" w:eastAsia="Georgia" w:hAnsi="Georgia"/>
-          <w:i/>
-          <w:color w:val="666666"/>
-          <w:sz w:val="16"/>
-          <w:szCs w:val="16"/>
-        </w:rPr>
-        <w:t xml:space="preserve">Auf dem Stein: Bild der Göttin Rḍy als weibliche Gestalt.</w:t>
-      </w:r>
-    </w:p>
-    <w:p>
-      <w:pPr>
-        <w:spacing w:before="260" w:after="40"/>
-      </w:pPr>
-      <w:r>
-        <w:rPr>
-          <w:rFonts w:ascii="Georgia" w:cs="Georgia" w:eastAsia="Georgia" w:hAnsi="Georgia"/>
-          <w:color w:val="7A5C3E"/>
-          <w:sz w:val="16"/>
-          <w:szCs w:val="16"/>
-        </w:rPr>
-        <w:t xml:space="preserve">Zalaf · C 1658</w:t>
-      </w:r>
-    </w:p>
-    <w:p>
-      <w:pPr>
-        <w:spacing w:after="40"/>
-      </w:pPr>
-      <w:r>
-        <w:rPr>
-          <w:rFonts w:ascii="Georgia" w:cs="Georgia" w:eastAsia="Georgia" w:hAnsi="Georgia"/>
-          <w:sz w:val="22"/>
-          <w:szCs w:val="22"/>
-        </w:rPr>
-        <w:t xml:space="preserve">Die beiden Kamele,</w:t>
-      </w:r>
-    </w:p>
-    <w:p>
-      <w:pPr>
-        <w:spacing w:after="40"/>
-      </w:pPr>
-      <w:r>
-        <w:rPr>
-          <w:rFonts w:ascii="Georgia" w:cs="Georgia" w:eastAsia="Georgia" w:hAnsi="Georgia"/>
-          <w:sz w:val="22"/>
-          <w:szCs w:val="22"/>
-        </w:rPr>
-        <w:t xml:space="preserve">Allat und Rudā geweiht.</w:t>
-      </w:r>
-    </w:p>
-    <w:p>
-      <w:pPr>
-        <w:spacing w:after="40"/>
-      </w:pPr>
-      <w:r>
-        <w:rPr>
-          <w:rFonts w:ascii="Georgia" w:cs="Georgia" w:eastAsia="Georgia" w:hAnsi="Georgia"/>
-          <w:sz w:val="22"/>
-          <w:szCs w:val="22"/>
-        </w:rPr>
-        <w:t xml:space="preserve">Yaṯaʿ —</w:t>
-      </w:r>
-    </w:p>
-    <w:p>
-      <w:pPr>
-        <w:spacing w:after="40"/>
-      </w:pPr>
-      <w:r>
-        <w:rPr>
-          <w:rFonts w:ascii="Georgia" w:cs="Georgia" w:eastAsia="Georgia" w:hAnsi="Georgia"/>
-          <w:sz w:val="22"/>
-          <w:szCs w:val="22"/>
-        </w:rPr>
-        <w:t xml:space="preserve">blende, wer dies austilgt.</w:t>
-      </w:r>
-    </w:p>
-    <w:p>
-      <w:pPr>
-        <w:spacing w:before="80" w:after="20"/>
+      <w:r>
+        <w:rPr>
+          <w:rFonts w:ascii="Georgia" w:cs="Georgia" w:eastAsia="Georgia" w:hAnsi="Georgia"/>
+          <w:color w:val="7A5C3E"/>
+          <w:sz w:val="16"/>
+          <w:szCs w:val="16"/>
+        </w:rPr>
+        <w:t xml:space="preserve">Rif Dimašq · C 286</w:t>
+      </w:r>
+    </w:p>
+    <w:p>
+      <w:pPr>
+        <w:spacing w:after="40"/>
+      </w:pPr>
+      <w:r>
+        <w:rPr>
+          <w:rFonts w:ascii="Georgia" w:cs="Georgia" w:eastAsia="Georgia" w:hAnsi="Georgia"/>
+          <w:sz w:val="22"/>
+          <w:szCs w:val="22"/>
+        </w:rPr>
+        <w:t xml:space="preserve">Rudā —</w:t>
+      </w:r>
+    </w:p>
+    <w:p>
+      <w:pPr>
+        <w:spacing w:after="40"/>
+      </w:pPr>
+      <w:r>
+        <w:rPr>
+          <w:rFonts w:ascii="Georgia" w:cs="Georgia" w:eastAsia="Georgia" w:hAnsi="Georgia"/>
+          <w:sz w:val="22"/>
+          <w:szCs w:val="22"/>
+        </w:rPr>
+        <w:t xml:space="preserve">wer dies austilgt,</w:t>
+      </w:r>
+    </w:p>
+    <w:p>
+      <w:pPr>
+        <w:spacing w:after="40"/>
+      </w:pPr>
+      <w:r>
+        <w:rPr>
+          <w:rFonts w:ascii="Georgia" w:cs="Georgia" w:eastAsia="Georgia" w:hAnsi="Georgia"/>
+          <w:sz w:val="22"/>
+          <w:szCs w:val="22"/>
+        </w:rPr>
+        <w:t xml:space="preserve">erblinde.</w:t>
+      </w:r>
+    </w:p>
+    <w:p>
+      <w:pPr>
+        <w:spacing w:before="260" w:after="40"/>
       </w:pPr>
       <w:r>
         <w:drawing>
-          <wp:inline distT="0" distB="0" distL="0" distR="0">
-            <wp:extent cx="3060000" cy="3130434"/>
+          <wp:anchor distT="0" distB="0" distL="114300" distR="114300" simplePos="0" relativeHeight="251667246" behindDoc="0" locked="0" layoutInCell="1" allowOverlap="1">
+            <wp:simplePos x="0" y="0"/>
+            <wp:positionH relativeFrom="margin">
+              <wp:align>right</wp:align>
+            </wp:positionH>
+            <wp:positionV relativeFrom="paragraph">
+              <wp:posOffset>0</wp:posOffset>
+            </wp:positionV>
+            <wp:extent cx="1650000" cy="1687979"/>
+            <wp:effectExtent l="0" t="0" r="0" b="0"/>
+            <wp:wrapSquare wrapText="left"/>
             <wp:docPr id="9006" name="rockart9006"/>
+            <wp:cNvGraphicFramePr/>
             <a:graphic xmlns:a="http://schemas.openxmlformats.org/drawingml/2006/main">
               <a:graphicData uri="http://schemas.openxmlformats.org/drawingml/2006/picture">
                 <pic:pic xmlns:pic="http://schemas.openxmlformats.org/drawingml/2006/picture">
@@ -6115,7 +6009,7 @@
                   <pic:spPr>
                     <a:xfrm>
                       <a:off x="0" y="0"/>
-                      <a:ext cx="3060000" cy="3130434"/>
+                      <a:ext cx="1650000" cy="1687979"/>
                     </a:xfrm>
                     <a:prstGeom prst="rect">
                       <a:avLst/>
@@ -6124,23 +6018,69 @@
                 </pic:pic>
               </a:graphicData>
             </a:graphic>
-          </wp:inline>
+          </wp:anchor>
         </w:drawing>
       </w:r>
-    </w:p>
-    <w:p>
-      <w:pPr>
-        <w:spacing w:after="120"/>
-      </w:pPr>
-      <w:r>
-        <w:rPr>
-          <w:rFonts w:ascii="Georgia" w:cs="Georgia" w:eastAsia="Georgia" w:hAnsi="Georgia"/>
-          <w:i/>
-          <w:color w:val="666666"/>
-          <w:sz w:val="16"/>
-          <w:szCs w:val="16"/>
-        </w:rPr>
-        <w:t xml:space="preserve">Auf dem Stein: zwei Kamele und ein Mann mit Schwert und Schild, in einer Kartusche.</w:t>
+      <w:r>
+        <w:rPr>
+          <w:rFonts w:ascii="Georgia" w:cs="Georgia" w:eastAsia="Georgia" w:hAnsi="Georgia"/>
+          <w:color w:val="7A5C3E"/>
+          <w:sz w:val="16"/>
+          <w:szCs w:val="16"/>
+        </w:rPr>
+        <w:t xml:space="preserve">Zalaf · C 1658</w:t>
+      </w:r>
+    </w:p>
+    <w:p>
+      <w:pPr>
+        <w:spacing w:after="40"/>
+      </w:pPr>
+      <w:r>
+        <w:rPr>
+          <w:rFonts w:ascii="Georgia" w:cs="Georgia" w:eastAsia="Georgia" w:hAnsi="Georgia"/>
+          <w:sz w:val="22"/>
+          <w:szCs w:val="22"/>
+        </w:rPr>
+        <w:t xml:space="preserve">Die beiden Kamele,</w:t>
+      </w:r>
+    </w:p>
+    <w:p>
+      <w:pPr>
+        <w:spacing w:after="40"/>
+      </w:pPr>
+      <w:r>
+        <w:rPr>
+          <w:rFonts w:ascii="Georgia" w:cs="Georgia" w:eastAsia="Georgia" w:hAnsi="Georgia"/>
+          <w:sz w:val="22"/>
+          <w:szCs w:val="22"/>
+        </w:rPr>
+        <w:t xml:space="preserve">Allat und Rudā geweiht.</w:t>
+      </w:r>
+    </w:p>
+    <w:p>
+      <w:pPr>
+        <w:spacing w:after="40"/>
+      </w:pPr>
+      <w:r>
+        <w:rPr>
+          <w:rFonts w:ascii="Georgia" w:cs="Georgia" w:eastAsia="Georgia" w:hAnsi="Georgia"/>
+          <w:sz w:val="22"/>
+          <w:szCs w:val="22"/>
+        </w:rPr>
+        <w:t xml:space="preserve">Yaṯaʿ —</w:t>
+      </w:r>
+    </w:p>
+    <w:p>
+      <w:pPr>
+        <w:spacing w:after="40"/>
+      </w:pPr>
+      <w:r>
+        <w:rPr>
+          <w:rFonts w:ascii="Georgia" w:cs="Georgia" w:eastAsia="Georgia" w:hAnsi="Georgia"/>
+          <w:sz w:val="22"/>
+          <w:szCs w:val="22"/>
+        </w:rPr>
+        <w:t xml:space="preserve">blende, wer dies austilgt.</w:t>
       </w:r>
     </w:p>
     <w:p>
@@ -6827,76 +6767,20 @@
         <w:spacing w:before="260" w:after="40"/>
       </w:pPr>
       <w:r>
-        <w:rPr>
-          <w:rFonts w:ascii="Georgia" w:cs="Georgia" w:eastAsia="Georgia" w:hAnsi="Georgia"/>
-          <w:color w:val="7A5C3E"/>
-          <w:sz w:val="16"/>
-          <w:szCs w:val="16"/>
-        </w:rPr>
-        <w:t xml:space="preserve">Zalaf · C 2670</w:t>
-      </w:r>
-    </w:p>
-    <w:p>
-      <w:pPr>
-        <w:spacing w:after="40"/>
-      </w:pPr>
-      <w:r>
-        <w:rPr>
-          <w:rFonts w:ascii="Georgia" w:cs="Georgia" w:eastAsia="Georgia" w:hAnsi="Georgia"/>
-          <w:sz w:val="22"/>
-          <w:szCs w:val="22"/>
-        </w:rPr>
-        <w:t xml:space="preserve">Er weidete die Kamele</w:t>
-      </w:r>
-    </w:p>
-    <w:p>
-      <w:pPr>
-        <w:spacing w:after="40"/>
-      </w:pPr>
-      <w:r>
-        <w:rPr>
-          <w:rFonts w:ascii="Georgia" w:cs="Georgia" w:eastAsia="Georgia" w:hAnsi="Georgia"/>
-          <w:sz w:val="22"/>
-          <w:szCs w:val="22"/>
-        </w:rPr>
-        <w:t xml:space="preserve">auf dem Frühjahrsgras,</w:t>
-      </w:r>
-    </w:p>
-    <w:p>
-      <w:pPr>
-        <w:spacing w:after="40"/>
-      </w:pPr>
-      <w:r>
-        <w:rPr>
-          <w:rFonts w:ascii="Georgia" w:cs="Georgia" w:eastAsia="Georgia" w:hAnsi="Georgia"/>
-          <w:sz w:val="22"/>
-          <w:szCs w:val="22"/>
-        </w:rPr>
-        <w:t xml:space="preserve">im Jahr, als Rhy gegen die Nabatäer stritt,</w:t>
-      </w:r>
-    </w:p>
-    <w:p>
-      <w:pPr>
-        <w:spacing w:after="40"/>
-      </w:pPr>
-      <w:r>
-        <w:rPr>
-          <w:rFonts w:ascii="Georgia" w:cs="Georgia" w:eastAsia="Georgia" w:hAnsi="Georgia"/>
-          <w:sz w:val="22"/>
-          <w:szCs w:val="22"/>
-        </w:rPr>
-        <w:t xml:space="preserve">und hielt Ausschau nach den Hwlt.</w:t>
-      </w:r>
-    </w:p>
-    <w:p>
-      <w:pPr>
-        <w:spacing w:before="80" w:after="20"/>
-      </w:pPr>
-      <w:r>
         <w:drawing>
-          <wp:inline distT="0" distB="0" distL="0" distR="0">
-            <wp:extent cx="3060000" cy="1813050"/>
+          <wp:anchor distT="0" distB="0" distL="114300" distR="114300" simplePos="0" relativeHeight="251667247" behindDoc="0" locked="0" layoutInCell="1" allowOverlap="1">
+            <wp:simplePos x="0" y="0"/>
+            <wp:positionH relativeFrom="margin">
+              <wp:align>right</wp:align>
+            </wp:positionH>
+            <wp:positionV relativeFrom="paragraph">
+              <wp:posOffset>0</wp:posOffset>
+            </wp:positionV>
+            <wp:extent cx="1650000" cy="977625"/>
+            <wp:effectExtent l="0" t="0" r="0" b="0"/>
+            <wp:wrapSquare wrapText="left"/>
             <wp:docPr id="9007" name="rockart9007"/>
+            <wp:cNvGraphicFramePr/>
             <a:graphic xmlns:a="http://schemas.openxmlformats.org/drawingml/2006/main">
               <a:graphicData uri="http://schemas.openxmlformats.org/drawingml/2006/picture">
                 <pic:pic xmlns:pic="http://schemas.openxmlformats.org/drawingml/2006/picture">
@@ -6913,7 +6797,7 @@
                   <pic:spPr>
                     <a:xfrm>
                       <a:off x="0" y="0"/>
-                      <a:ext cx="3060000" cy="1813050"/>
+                      <a:ext cx="1650000" cy="977625"/>
                     </a:xfrm>
                     <a:prstGeom prst="rect">
                       <a:avLst/>
@@ -6922,23 +6806,69 @@
                 </pic:pic>
               </a:graphicData>
             </a:graphic>
-          </wp:inline>
+          </wp:anchor>
         </w:drawing>
       </w:r>
-    </w:p>
-    <w:p>
-      <w:pPr>
-        <w:spacing w:after="120"/>
-      </w:pPr>
-      <w:r>
-        <w:rPr>
-          <w:rFonts w:ascii="Georgia" w:cs="Georgia" w:eastAsia="Georgia" w:hAnsi="Georgia"/>
-          <w:i/>
-          <w:color w:val="666666"/>
-          <w:sz w:val="16"/>
-          <w:szCs w:val="16"/>
-        </w:rPr>
-        <w:t xml:space="preserve">Auf dem Stein: Umriss eines Oryx.</w:t>
+      <w:r>
+        <w:rPr>
+          <w:rFonts w:ascii="Georgia" w:cs="Georgia" w:eastAsia="Georgia" w:hAnsi="Georgia"/>
+          <w:color w:val="7A5C3E"/>
+          <w:sz w:val="16"/>
+          <w:szCs w:val="16"/>
+        </w:rPr>
+        <w:t xml:space="preserve">Zalaf · C 2670</w:t>
+      </w:r>
+    </w:p>
+    <w:p>
+      <w:pPr>
+        <w:spacing w:after="40"/>
+      </w:pPr>
+      <w:r>
+        <w:rPr>
+          <w:rFonts w:ascii="Georgia" w:cs="Georgia" w:eastAsia="Georgia" w:hAnsi="Georgia"/>
+          <w:sz w:val="22"/>
+          <w:szCs w:val="22"/>
+        </w:rPr>
+        <w:t xml:space="preserve">Er weidete die Kamele</w:t>
+      </w:r>
+    </w:p>
+    <w:p>
+      <w:pPr>
+        <w:spacing w:after="40"/>
+      </w:pPr>
+      <w:r>
+        <w:rPr>
+          <w:rFonts w:ascii="Georgia" w:cs="Georgia" w:eastAsia="Georgia" w:hAnsi="Georgia"/>
+          <w:sz w:val="22"/>
+          <w:szCs w:val="22"/>
+        </w:rPr>
+        <w:t xml:space="preserve">auf dem Frühjahrsgras,</w:t>
+      </w:r>
+    </w:p>
+    <w:p>
+      <w:pPr>
+        <w:spacing w:after="40"/>
+      </w:pPr>
+      <w:r>
+        <w:rPr>
+          <w:rFonts w:ascii="Georgia" w:cs="Georgia" w:eastAsia="Georgia" w:hAnsi="Georgia"/>
+          <w:sz w:val="22"/>
+          <w:szCs w:val="22"/>
+        </w:rPr>
+        <w:t xml:space="preserve">im Jahr, als Rhy gegen die Nabatäer stritt,</w:t>
+      </w:r>
+    </w:p>
+    <w:p>
+      <w:pPr>
+        <w:spacing w:after="40"/>
+      </w:pPr>
+      <w:r>
+        <w:rPr>
+          <w:rFonts w:ascii="Georgia" w:cs="Georgia" w:eastAsia="Georgia" w:hAnsi="Georgia"/>
+          <w:sz w:val="22"/>
+          <w:szCs w:val="22"/>
+        </w:rPr>
+        <w:t xml:space="preserve">und hielt Ausschau nach den Hwlt.</w:t>
       </w:r>
     </w:p>
     <w:p>
@@ -7801,7 +7731,7 @@
           <w:sz w:val="22"/>
           <w:szCs w:val="22"/>
         </w:rPr>
-        <w:t xml:space="preserve">Jedes Register speist aus seinem eigenen Korpus-Material: die Signaturen für „schreibe“ und „stehe“, die Anrufungen für „bitte“, die Fluchformeln für „verfluche“, die fragmentarischen Steine für „schweige“, die datierten für „bezeuge“. Die Auswahl ist kuratiert, nicht repräsentativ; jede Nachdichtung trägt die Sigle ihrer Quelle im Korpus.</w:t>
+        <w:t xml:space="preserve">Jedes Register speist aus seinem eigenen Korpus-Material: die Signaturen für „schreibe“ und „stehe“, die Anrufungen für „bitte“, die Fluchformeln für „fluche“, die fragmentarischen Steine für „schweige“, die datierten für „bezeuge“. Die Auswahl ist kuratiert, nicht repräsentativ; jede Nachdichtung trägt die Sigle ihrer Quelle im Korpus.</w:t>
       </w:r>
     </w:p>
     <w:p>
@@ -7887,6 +7817,63 @@
         <w:gridCol w:w="2400"/>
         <w:gridCol w:w="6600"/>
       </w:tblGrid>
+      <w:tr>
+        <w:tc>
+          <w:tcPr>
+            <w:tcW w:type="dxa" w:w="2400"/>
+            <w:tcBorders>
+              <w:top w:val="single" w:color="DDDDDD" w:sz="4"/>
+              <w:left w:val="single" w:color="DDDDDD" w:sz="4"/>
+              <w:bottom w:val="single" w:color="DDDDDD" w:sz="4"/>
+              <w:right w:val="single" w:color="DDDDDD" w:sz="4"/>
+            </w:tcBorders>
+            <w:tcMar>
+              <w:top w:type="dxa" w:w="60"/>
+              <w:left w:type="dxa" w:w="100"/>
+              <w:bottom w:type="dxa" w:w="60"/>
+              <w:right w:type="dxa" w:w="100"/>
+            </w:tcMar>
+          </w:tcPr>
+          <w:p>
+            <w:r>
+              <w:rPr>
+                <w:rFonts w:ascii="Georgia" w:cs="Georgia" w:eastAsia="Georgia" w:hAnsi="Georgia"/>
+                <w:b/>
+                <w:sz w:val="18"/>
+                <w:szCs w:val="18"/>
+              </w:rPr>
+              <w:t xml:space="preserve">AbaNS / HaNSB / HaNS / HNSD / HSNS</w:t>
+            </w:r>
+          </w:p>
+        </w:tc>
+        <w:tc>
+          <w:tcPr>
+            <w:tcW w:type="dxa" w:w="6600"/>
+            <w:tcBorders>
+              <w:top w:val="single" w:color="DDDDDD" w:sz="4"/>
+              <w:left w:val="single" w:color="DDDDDD" w:sz="4"/>
+              <w:bottom w:val="single" w:color="DDDDDD" w:sz="4"/>
+              <w:right w:val="single" w:color="DDDDDD" w:sz="4"/>
+            </w:tcBorders>
+            <w:tcMar>
+              <w:top w:type="dxa" w:w="60"/>
+              <w:left w:type="dxa" w:w="100"/>
+              <w:bottom w:type="dxa" w:w="60"/>
+              <w:right w:type="dxa" w:w="100"/>
+            </w:tcMar>
+          </w:tcPr>
+          <w:p>
+            <w:r>
+              <w:rPr>
+                <w:rFonts w:ascii="Georgia" w:cs="Georgia" w:eastAsia="Georgia" w:hAnsi="Georgia"/>
+                <w:sz w:val="18"/>
+                <w:szCs w:val="18"/>
+              </w:rPr>
+              <w:t xml:space="preserve">nordjordanische Safaitic-Surveys; OCIANA.</w:t>
+            </w:r>
+          </w:p>
+        </w:tc>
+      </w:tr>
       <w:tr>
         <w:tc>
           <w:tcPr>
@@ -7940,6 +7927,348 @@
                 <w:szCs w:val="18"/>
               </w:rPr>
               <w:t xml:space="preserve">Corpus Inscriptionum Semiticarum, Pars V — safaitische Inschriften (u. a. Dussaud &amp; Macler; Ryckmans 1950).</w:t>
+            </w:r>
+          </w:p>
+        </w:tc>
+      </w:tr>
+      <w:tr>
+        <w:tc>
+          <w:tcPr>
+            <w:tcW w:type="dxa" w:w="2400"/>
+            <w:tcBorders>
+              <w:top w:val="single" w:color="DDDDDD" w:sz="4"/>
+              <w:left w:val="single" w:color="DDDDDD" w:sz="4"/>
+              <w:bottom w:val="single" w:color="DDDDDD" w:sz="4"/>
+              <w:right w:val="single" w:color="DDDDDD" w:sz="4"/>
+            </w:tcBorders>
+            <w:tcMar>
+              <w:top w:type="dxa" w:w="60"/>
+              <w:left w:type="dxa" w:w="100"/>
+              <w:bottom w:type="dxa" w:w="60"/>
+              <w:right w:type="dxa" w:w="100"/>
+            </w:tcMar>
+          </w:tcPr>
+          <w:p>
+            <w:r>
+              <w:rPr>
+                <w:rFonts w:ascii="Georgia" w:cs="Georgia" w:eastAsia="Georgia" w:hAnsi="Georgia"/>
+                <w:b/>
+                <w:sz w:val="18"/>
+                <w:szCs w:val="18"/>
+              </w:rPr>
+              <w:t xml:space="preserve">CSNS</w:t>
+            </w:r>
+          </w:p>
+        </w:tc>
+        <w:tc>
+          <w:tcPr>
+            <w:tcW w:type="dxa" w:w="6600"/>
+            <w:tcBorders>
+              <w:top w:val="single" w:color="DDDDDD" w:sz="4"/>
+              <w:left w:val="single" w:color="DDDDDD" w:sz="4"/>
+              <w:bottom w:val="single" w:color="DDDDDD" w:sz="4"/>
+              <w:right w:val="single" w:color="DDDDDD" w:sz="4"/>
+            </w:tcBorders>
+            <w:tcMar>
+              <w:top w:type="dxa" w:w="60"/>
+              <w:left w:type="dxa" w:w="100"/>
+              <w:bottom w:type="dxa" w:w="60"/>
+              <w:right w:type="dxa" w:w="100"/>
+            </w:tcMar>
+          </w:tcPr>
+          <w:p>
+            <w:r>
+              <w:rPr>
+                <w:rFonts w:ascii="Georgia" w:cs="Georgia" w:eastAsia="Georgia" w:hAnsi="Georgia"/>
+                <w:sz w:val="18"/>
+                <w:szCs w:val="18"/>
+              </w:rPr>
+              <w:t xml:space="preserve">V. A. Clark, A Study of New Safaitic Inscriptions from Jordan (1979).</w:t>
+            </w:r>
+          </w:p>
+        </w:tc>
+      </w:tr>
+      <w:tr>
+        <w:tc>
+          <w:tcPr>
+            <w:tcW w:type="dxa" w:w="2400"/>
+            <w:tcBorders>
+              <w:top w:val="single" w:color="DDDDDD" w:sz="4"/>
+              <w:left w:val="single" w:color="DDDDDD" w:sz="4"/>
+              <w:bottom w:val="single" w:color="DDDDDD" w:sz="4"/>
+              <w:right w:val="single" w:color="DDDDDD" w:sz="4"/>
+            </w:tcBorders>
+            <w:tcMar>
+              <w:top w:type="dxa" w:w="60"/>
+              <w:left w:type="dxa" w:w="100"/>
+              <w:bottom w:type="dxa" w:w="60"/>
+              <w:right w:type="dxa" w:w="100"/>
+            </w:tcMar>
+          </w:tcPr>
+          <w:p>
+            <w:r>
+              <w:rPr>
+                <w:rFonts w:ascii="Georgia" w:cs="Georgia" w:eastAsia="Georgia" w:hAnsi="Georgia"/>
+                <w:b/>
+                <w:sz w:val="18"/>
+                <w:szCs w:val="18"/>
+              </w:rPr>
+              <w:t xml:space="preserve">HCH</w:t>
+            </w:r>
+          </w:p>
+        </w:tc>
+        <w:tc>
+          <w:tcPr>
+            <w:tcW w:type="dxa" w:w="6600"/>
+            <w:tcBorders>
+              <w:top w:val="single" w:color="DDDDDD" w:sz="4"/>
+              <w:left w:val="single" w:color="DDDDDD" w:sz="4"/>
+              <w:bottom w:val="single" w:color="DDDDDD" w:sz="4"/>
+              <w:right w:val="single" w:color="DDDDDD" w:sz="4"/>
+            </w:tcBorders>
+            <w:tcMar>
+              <w:top w:type="dxa" w:w="60"/>
+              <w:left w:type="dxa" w:w="100"/>
+              <w:bottom w:type="dxa" w:w="60"/>
+              <w:right w:type="dxa" w:w="100"/>
+            </w:tcMar>
+          </w:tcPr>
+          <w:p>
+            <w:r>
+              <w:rPr>
+                <w:rFonts w:ascii="Georgia" w:cs="Georgia" w:eastAsia="Georgia" w:hAnsi="Georgia"/>
+                <w:sz w:val="18"/>
+                <w:szCs w:val="18"/>
+              </w:rPr>
+              <w:t xml:space="preserve">G. L. Harding, The Cairn of Hāniʾ (1953).</w:t>
+            </w:r>
+          </w:p>
+        </w:tc>
+      </w:tr>
+      <w:tr>
+        <w:tc>
+          <w:tcPr>
+            <w:tcW w:type="dxa" w:w="2400"/>
+            <w:tcBorders>
+              <w:top w:val="single" w:color="DDDDDD" w:sz="4"/>
+              <w:left w:val="single" w:color="DDDDDD" w:sz="4"/>
+              <w:bottom w:val="single" w:color="DDDDDD" w:sz="4"/>
+              <w:right w:val="single" w:color="DDDDDD" w:sz="4"/>
+            </w:tcBorders>
+            <w:tcMar>
+              <w:top w:type="dxa" w:w="60"/>
+              <w:left w:type="dxa" w:w="100"/>
+              <w:bottom w:type="dxa" w:w="60"/>
+              <w:right w:type="dxa" w:w="100"/>
+            </w:tcMar>
+          </w:tcPr>
+          <w:p>
+            <w:r>
+              <w:rPr>
+                <w:rFonts w:ascii="Georgia" w:cs="Georgia" w:eastAsia="Georgia" w:hAnsi="Georgia"/>
+                <w:b/>
+                <w:sz w:val="18"/>
+                <w:szCs w:val="18"/>
+              </w:rPr>
+              <w:t xml:space="preserve">Is.L / Is.Mu</w:t>
+            </w:r>
+          </w:p>
+        </w:tc>
+        <w:tc>
+          <w:tcPr>
+            <w:tcW w:type="dxa" w:w="6600"/>
+            <w:tcBorders>
+              <w:top w:val="single" w:color="DDDDDD" w:sz="4"/>
+              <w:left w:val="single" w:color="DDDDDD" w:sz="4"/>
+              <w:bottom w:val="single" w:color="DDDDDD" w:sz="4"/>
+              <w:right w:val="single" w:color="DDDDDD" w:sz="4"/>
+            </w:tcBorders>
+            <w:tcMar>
+              <w:top w:type="dxa" w:w="60"/>
+              <w:left w:type="dxa" w:w="100"/>
+              <w:bottom w:type="dxa" w:w="60"/>
+              <w:right w:type="dxa" w:w="100"/>
+            </w:tcMar>
+          </w:tcPr>
+          <w:p>
+            <w:r>
+              <w:rPr>
+                <w:rFonts w:ascii="Georgia" w:cs="Georgia" w:eastAsia="Georgia" w:hAnsi="Georgia"/>
+                <w:sz w:val="18"/>
+                <w:szCs w:val="18"/>
+              </w:rPr>
+              <w:t xml:space="preserve">Sammlungen aus al-ʿĪsāwī (Rif Dimašq); Nachweis im OCIANA-Eintrag.</w:t>
+            </w:r>
+          </w:p>
+        </w:tc>
+      </w:tr>
+      <w:tr>
+        <w:tc>
+          <w:tcPr>
+            <w:tcW w:type="dxa" w:w="2400"/>
+            <w:tcBorders>
+              <w:top w:val="single" w:color="DDDDDD" w:sz="4"/>
+              <w:left w:val="single" w:color="DDDDDD" w:sz="4"/>
+              <w:bottom w:val="single" w:color="DDDDDD" w:sz="4"/>
+              <w:right w:val="single" w:color="DDDDDD" w:sz="4"/>
+            </w:tcBorders>
+            <w:tcMar>
+              <w:top w:type="dxa" w:w="60"/>
+              <w:left w:type="dxa" w:w="100"/>
+              <w:bottom w:type="dxa" w:w="60"/>
+              <w:right w:type="dxa" w:w="100"/>
+            </w:tcMar>
+          </w:tcPr>
+          <w:p>
+            <w:r>
+              <w:rPr>
+                <w:rFonts w:ascii="Georgia" w:cs="Georgia" w:eastAsia="Georgia" w:hAnsi="Georgia"/>
+                <w:b/>
+                <w:sz w:val="18"/>
+                <w:szCs w:val="18"/>
+              </w:rPr>
+              <w:t xml:space="preserve">ISB</w:t>
+            </w:r>
+          </w:p>
+        </w:tc>
+        <w:tc>
+          <w:tcPr>
+            <w:tcW w:type="dxa" w:w="6600"/>
+            <w:tcBorders>
+              <w:top w:val="single" w:color="DDDDDD" w:sz="4"/>
+              <w:left w:val="single" w:color="DDDDDD" w:sz="4"/>
+              <w:bottom w:val="single" w:color="DDDDDD" w:sz="4"/>
+              <w:right w:val="single" w:color="DDDDDD" w:sz="4"/>
+            </w:tcBorders>
+            <w:tcMar>
+              <w:top w:type="dxa" w:w="60"/>
+              <w:left w:type="dxa" w:w="100"/>
+              <w:bottom w:type="dxa" w:w="60"/>
+              <w:right w:type="dxa" w:w="100"/>
+            </w:tcMar>
+          </w:tcPr>
+          <w:p>
+            <w:r>
+              <w:rPr>
+                <w:rFonts w:ascii="Georgia" w:cs="Georgia" w:eastAsia="Georgia" w:hAnsi="Georgia"/>
+                <w:sz w:val="18"/>
+                <w:szCs w:val="18"/>
+              </w:rPr>
+              <w:t xml:space="preserve">W. G. Oxtoby, Some Inscriptions of the Safaitic Bedouin (New Haven 1968).</w:t>
+            </w:r>
+          </w:p>
+        </w:tc>
+      </w:tr>
+      <w:tr>
+        <w:tc>
+          <w:tcPr>
+            <w:tcW w:type="dxa" w:w="2400"/>
+            <w:tcBorders>
+              <w:top w:val="single" w:color="DDDDDD" w:sz="4"/>
+              <w:left w:val="single" w:color="DDDDDD" w:sz="4"/>
+              <w:bottom w:val="single" w:color="DDDDDD" w:sz="4"/>
+              <w:right w:val="single" w:color="DDDDDD" w:sz="4"/>
+            </w:tcBorders>
+            <w:tcMar>
+              <w:top w:type="dxa" w:w="60"/>
+              <w:left w:type="dxa" w:w="100"/>
+              <w:bottom w:type="dxa" w:w="60"/>
+              <w:right w:type="dxa" w:w="100"/>
+            </w:tcMar>
+          </w:tcPr>
+          <w:p>
+            <w:r>
+              <w:rPr>
+                <w:rFonts w:ascii="Georgia" w:cs="Georgia" w:eastAsia="Georgia" w:hAnsi="Georgia"/>
+                <w:b/>
+                <w:sz w:val="18"/>
+                <w:szCs w:val="18"/>
+              </w:rPr>
+              <w:t xml:space="preserve">JaS / KWQ / CEDS / GSSH / MKJS / BS / HYGQ / WAMS / RVP / BWM / ASFF / ZN</w:t>
+            </w:r>
+          </w:p>
+        </w:tc>
+        <w:tc>
+          <w:tcPr>
+            <w:tcW w:type="dxa" w:w="6600"/>
+            <w:tcBorders>
+              <w:top w:val="single" w:color="DDDDDD" w:sz="4"/>
+              <w:left w:val="single" w:color="DDDDDD" w:sz="4"/>
+              <w:bottom w:val="single" w:color="DDDDDD" w:sz="4"/>
+              <w:right w:val="single" w:color="DDDDDD" w:sz="4"/>
+            </w:tcBorders>
+            <w:tcMar>
+              <w:top w:type="dxa" w:w="60"/>
+              <w:left w:type="dxa" w:w="100"/>
+              <w:bottom w:type="dxa" w:w="60"/>
+              <w:right w:type="dxa" w:w="100"/>
+            </w:tcMar>
+          </w:tcPr>
+          <w:p>
+            <w:r>
+              <w:rPr>
+                <w:rFonts w:ascii="Georgia" w:cs="Georgia" w:eastAsia="Georgia" w:hAnsi="Georgia"/>
+                <w:sz w:val="18"/>
+                <w:szCs w:val="18"/>
+              </w:rPr>
+              <w:t xml:space="preserve">weitere OCIANA-Survey-Siglen; vollständiger Editionsnachweis jeweils im OCIANA-Eintrag.</w:t>
+            </w:r>
+          </w:p>
+        </w:tc>
+      </w:tr>
+      <w:tr>
+        <w:tc>
+          <w:tcPr>
+            <w:tcW w:type="dxa" w:w="2400"/>
+            <w:tcBorders>
+              <w:top w:val="single" w:color="DDDDDD" w:sz="4"/>
+              <w:left w:val="single" w:color="DDDDDD" w:sz="4"/>
+              <w:bottom w:val="single" w:color="DDDDDD" w:sz="4"/>
+              <w:right w:val="single" w:color="DDDDDD" w:sz="4"/>
+            </w:tcBorders>
+            <w:tcMar>
+              <w:top w:type="dxa" w:w="60"/>
+              <w:left w:type="dxa" w:w="100"/>
+              <w:bottom w:type="dxa" w:w="60"/>
+              <w:right w:type="dxa" w:w="100"/>
+            </w:tcMar>
+          </w:tcPr>
+          <w:p>
+            <w:r>
+              <w:rPr>
+                <w:rFonts w:ascii="Georgia" w:cs="Georgia" w:eastAsia="Georgia" w:hAnsi="Georgia"/>
+                <w:b/>
+                <w:sz w:val="18"/>
+                <w:szCs w:val="18"/>
+              </w:rPr>
+              <w:t xml:space="preserve">KRS</w:t>
+            </w:r>
+          </w:p>
+        </w:tc>
+        <w:tc>
+          <w:tcPr>
+            <w:tcW w:type="dxa" w:w="6600"/>
+            <w:tcBorders>
+              <w:top w:val="single" w:color="DDDDDD" w:sz="4"/>
+              <w:left w:val="single" w:color="DDDDDD" w:sz="4"/>
+              <w:bottom w:val="single" w:color="DDDDDD" w:sz="4"/>
+              <w:right w:val="single" w:color="DDDDDD" w:sz="4"/>
+            </w:tcBorders>
+            <w:tcMar>
+              <w:top w:type="dxa" w:w="60"/>
+              <w:left w:type="dxa" w:w="100"/>
+              <w:bottom w:type="dxa" w:w="60"/>
+              <w:right w:type="dxa" w:w="100"/>
+            </w:tcMar>
+          </w:tcPr>
+          <w:p>
+            <w:r>
+              <w:rPr>
+                <w:rFonts w:ascii="Georgia" w:cs="Georgia" w:eastAsia="Georgia" w:hAnsi="Georgia"/>
+                <w:sz w:val="18"/>
+                <w:szCs w:val="18"/>
+              </w:rPr>
+              <w:t xml:space="preserve">Basalt Desert Rescue Survey (G. M. H. King, 1989) — NO-jordanische Ḥarrah.</w:t>
             </w:r>
           </w:p>
         </w:tc>
@@ -8026,348 +8355,6 @@
                 <w:sz w:val="18"/>
                 <w:szCs w:val="18"/>
               </w:rPr>
-              <w:t xml:space="preserve">WH</w:t>
-            </w:r>
-          </w:p>
-        </w:tc>
-        <w:tc>
-          <w:tcPr>
-            <w:tcW w:type="dxa" w:w="6600"/>
-            <w:tcBorders>
-              <w:top w:val="single" w:color="DDDDDD" w:sz="4"/>
-              <w:left w:val="single" w:color="DDDDDD" w:sz="4"/>
-              <w:bottom w:val="single" w:color="DDDDDD" w:sz="4"/>
-              <w:right w:val="single" w:color="DDDDDD" w:sz="4"/>
-            </w:tcBorders>
-            <w:tcMar>
-              <w:top w:type="dxa" w:w="60"/>
-              <w:left w:type="dxa" w:w="100"/>
-              <w:bottom w:type="dxa" w:w="60"/>
-              <w:right w:type="dxa" w:w="100"/>
-            </w:tcMar>
-          </w:tcPr>
-          <w:p>
-            <w:r>
-              <w:rPr>
-                <w:rFonts w:ascii="Georgia" w:cs="Georgia" w:eastAsia="Georgia" w:hAnsi="Georgia"/>
-                <w:sz w:val="18"/>
-                <w:szCs w:val="18"/>
-              </w:rPr>
-              <w:t xml:space="preserve">F. V. Winnett &amp; G. L. Harding, Inscriptions from Fifty Safaitic Cairns (Toronto 1978).</w:t>
-            </w:r>
-          </w:p>
-        </w:tc>
-      </w:tr>
-      <w:tr>
-        <w:tc>
-          <w:tcPr>
-            <w:tcW w:type="dxa" w:w="2400"/>
-            <w:tcBorders>
-              <w:top w:val="single" w:color="DDDDDD" w:sz="4"/>
-              <w:left w:val="single" w:color="DDDDDD" w:sz="4"/>
-              <w:bottom w:val="single" w:color="DDDDDD" w:sz="4"/>
-              <w:right w:val="single" w:color="DDDDDD" w:sz="4"/>
-            </w:tcBorders>
-            <w:tcMar>
-              <w:top w:type="dxa" w:w="60"/>
-              <w:left w:type="dxa" w:w="100"/>
-              <w:bottom w:type="dxa" w:w="60"/>
-              <w:right w:type="dxa" w:w="100"/>
-            </w:tcMar>
-          </w:tcPr>
-          <w:p>
-            <w:r>
-              <w:rPr>
-                <w:rFonts w:ascii="Georgia" w:cs="Georgia" w:eastAsia="Georgia" w:hAnsi="Georgia"/>
-                <w:b/>
-                <w:sz w:val="18"/>
-                <w:szCs w:val="18"/>
-              </w:rPr>
-              <w:t xml:space="preserve">KRS</w:t>
-            </w:r>
-          </w:p>
-        </w:tc>
-        <w:tc>
-          <w:tcPr>
-            <w:tcW w:type="dxa" w:w="6600"/>
-            <w:tcBorders>
-              <w:top w:val="single" w:color="DDDDDD" w:sz="4"/>
-              <w:left w:val="single" w:color="DDDDDD" w:sz="4"/>
-              <w:bottom w:val="single" w:color="DDDDDD" w:sz="4"/>
-              <w:right w:val="single" w:color="DDDDDD" w:sz="4"/>
-            </w:tcBorders>
-            <w:tcMar>
-              <w:top w:type="dxa" w:w="60"/>
-              <w:left w:type="dxa" w:w="100"/>
-              <w:bottom w:type="dxa" w:w="60"/>
-              <w:right w:type="dxa" w:w="100"/>
-            </w:tcMar>
-          </w:tcPr>
-          <w:p>
-            <w:r>
-              <w:rPr>
-                <w:rFonts w:ascii="Georgia" w:cs="Georgia" w:eastAsia="Georgia" w:hAnsi="Georgia"/>
-                <w:sz w:val="18"/>
-                <w:szCs w:val="18"/>
-              </w:rPr>
-              <w:t xml:space="preserve">Basalt Desert Rescue Survey (G. M. H. King, 1989) — NO-jordanische Ḥarrah.</w:t>
-            </w:r>
-          </w:p>
-        </w:tc>
-      </w:tr>
-      <w:tr>
-        <w:tc>
-          <w:tcPr>
-            <w:tcW w:type="dxa" w:w="2400"/>
-            <w:tcBorders>
-              <w:top w:val="single" w:color="DDDDDD" w:sz="4"/>
-              <w:left w:val="single" w:color="DDDDDD" w:sz="4"/>
-              <w:bottom w:val="single" w:color="DDDDDD" w:sz="4"/>
-              <w:right w:val="single" w:color="DDDDDD" w:sz="4"/>
-            </w:tcBorders>
-            <w:tcMar>
-              <w:top w:type="dxa" w:w="60"/>
-              <w:left w:type="dxa" w:w="100"/>
-              <w:bottom w:type="dxa" w:w="60"/>
-              <w:right w:type="dxa" w:w="100"/>
-            </w:tcMar>
-          </w:tcPr>
-          <w:p>
-            <w:r>
-              <w:rPr>
-                <w:rFonts w:ascii="Georgia" w:cs="Georgia" w:eastAsia="Georgia" w:hAnsi="Georgia"/>
-                <w:b/>
-                <w:sz w:val="18"/>
-                <w:szCs w:val="18"/>
-              </w:rPr>
-              <w:t xml:space="preserve">HCH</w:t>
-            </w:r>
-          </w:p>
-        </w:tc>
-        <w:tc>
-          <w:tcPr>
-            <w:tcW w:type="dxa" w:w="6600"/>
-            <w:tcBorders>
-              <w:top w:val="single" w:color="DDDDDD" w:sz="4"/>
-              <w:left w:val="single" w:color="DDDDDD" w:sz="4"/>
-              <w:bottom w:val="single" w:color="DDDDDD" w:sz="4"/>
-              <w:right w:val="single" w:color="DDDDDD" w:sz="4"/>
-            </w:tcBorders>
-            <w:tcMar>
-              <w:top w:type="dxa" w:w="60"/>
-              <w:left w:type="dxa" w:w="100"/>
-              <w:bottom w:type="dxa" w:w="60"/>
-              <w:right w:type="dxa" w:w="100"/>
-            </w:tcMar>
-          </w:tcPr>
-          <w:p>
-            <w:r>
-              <w:rPr>
-                <w:rFonts w:ascii="Georgia" w:cs="Georgia" w:eastAsia="Georgia" w:hAnsi="Georgia"/>
-                <w:sz w:val="18"/>
-                <w:szCs w:val="18"/>
-              </w:rPr>
-              <w:t xml:space="preserve">G. L. Harding, The Cairn of Hāniʾ (1953).</w:t>
-            </w:r>
-          </w:p>
-        </w:tc>
-      </w:tr>
-      <w:tr>
-        <w:tc>
-          <w:tcPr>
-            <w:tcW w:type="dxa" w:w="2400"/>
-            <w:tcBorders>
-              <w:top w:val="single" w:color="DDDDDD" w:sz="4"/>
-              <w:left w:val="single" w:color="DDDDDD" w:sz="4"/>
-              <w:bottom w:val="single" w:color="DDDDDD" w:sz="4"/>
-              <w:right w:val="single" w:color="DDDDDD" w:sz="4"/>
-            </w:tcBorders>
-            <w:tcMar>
-              <w:top w:type="dxa" w:w="60"/>
-              <w:left w:type="dxa" w:w="100"/>
-              <w:bottom w:type="dxa" w:w="60"/>
-              <w:right w:type="dxa" w:w="100"/>
-            </w:tcMar>
-          </w:tcPr>
-          <w:p>
-            <w:r>
-              <w:rPr>
-                <w:rFonts w:ascii="Georgia" w:cs="Georgia" w:eastAsia="Georgia" w:hAnsi="Georgia"/>
-                <w:b/>
-                <w:sz w:val="18"/>
-                <w:szCs w:val="18"/>
-              </w:rPr>
-              <w:t xml:space="preserve">SIJ</w:t>
-            </w:r>
-          </w:p>
-        </w:tc>
-        <w:tc>
-          <w:tcPr>
-            <w:tcW w:type="dxa" w:w="6600"/>
-            <w:tcBorders>
-              <w:top w:val="single" w:color="DDDDDD" w:sz="4"/>
-              <w:left w:val="single" w:color="DDDDDD" w:sz="4"/>
-              <w:bottom w:val="single" w:color="DDDDDD" w:sz="4"/>
-              <w:right w:val="single" w:color="DDDDDD" w:sz="4"/>
-            </w:tcBorders>
-            <w:tcMar>
-              <w:top w:type="dxa" w:w="60"/>
-              <w:left w:type="dxa" w:w="100"/>
-              <w:bottom w:type="dxa" w:w="60"/>
-              <w:right w:type="dxa" w:w="100"/>
-            </w:tcMar>
-          </w:tcPr>
-          <w:p>
-            <w:r>
-              <w:rPr>
-                <w:rFonts w:ascii="Georgia" w:cs="Georgia" w:eastAsia="Georgia" w:hAnsi="Georgia"/>
-                <w:sz w:val="18"/>
-                <w:szCs w:val="18"/>
-              </w:rPr>
-              <w:t xml:space="preserve">F. V. Winnett, Safaitic Inscriptions from Jordan (Toronto 1957).</w:t>
-            </w:r>
-          </w:p>
-        </w:tc>
-      </w:tr>
-      <w:tr>
-        <w:tc>
-          <w:tcPr>
-            <w:tcW w:type="dxa" w:w="2400"/>
-            <w:tcBorders>
-              <w:top w:val="single" w:color="DDDDDD" w:sz="4"/>
-              <w:left w:val="single" w:color="DDDDDD" w:sz="4"/>
-              <w:bottom w:val="single" w:color="DDDDDD" w:sz="4"/>
-              <w:right w:val="single" w:color="DDDDDD" w:sz="4"/>
-            </w:tcBorders>
-            <w:tcMar>
-              <w:top w:type="dxa" w:w="60"/>
-              <w:left w:type="dxa" w:w="100"/>
-              <w:bottom w:type="dxa" w:w="60"/>
-              <w:right w:type="dxa" w:w="100"/>
-            </w:tcMar>
-          </w:tcPr>
-          <w:p>
-            <w:r>
-              <w:rPr>
-                <w:rFonts w:ascii="Georgia" w:cs="Georgia" w:eastAsia="Georgia" w:hAnsi="Georgia"/>
-                <w:b/>
-                <w:sz w:val="18"/>
-                <w:szCs w:val="18"/>
-              </w:rPr>
-              <w:t xml:space="preserve">ISB</w:t>
-            </w:r>
-          </w:p>
-        </w:tc>
-        <w:tc>
-          <w:tcPr>
-            <w:tcW w:type="dxa" w:w="6600"/>
-            <w:tcBorders>
-              <w:top w:val="single" w:color="DDDDDD" w:sz="4"/>
-              <w:left w:val="single" w:color="DDDDDD" w:sz="4"/>
-              <w:bottom w:val="single" w:color="DDDDDD" w:sz="4"/>
-              <w:right w:val="single" w:color="DDDDDD" w:sz="4"/>
-            </w:tcBorders>
-            <w:tcMar>
-              <w:top w:type="dxa" w:w="60"/>
-              <w:left w:type="dxa" w:w="100"/>
-              <w:bottom w:type="dxa" w:w="60"/>
-              <w:right w:type="dxa" w:w="100"/>
-            </w:tcMar>
-          </w:tcPr>
-          <w:p>
-            <w:r>
-              <w:rPr>
-                <w:rFonts w:ascii="Georgia" w:cs="Georgia" w:eastAsia="Georgia" w:hAnsi="Georgia"/>
-                <w:sz w:val="18"/>
-                <w:szCs w:val="18"/>
-              </w:rPr>
-              <w:t xml:space="preserve">W. G. Oxtoby, Some Inscriptions of the Safaitic Bedouin (New Haven 1968).</w:t>
-            </w:r>
-          </w:p>
-        </w:tc>
-      </w:tr>
-      <w:tr>
-        <w:tc>
-          <w:tcPr>
-            <w:tcW w:type="dxa" w:w="2400"/>
-            <w:tcBorders>
-              <w:top w:val="single" w:color="DDDDDD" w:sz="4"/>
-              <w:left w:val="single" w:color="DDDDDD" w:sz="4"/>
-              <w:bottom w:val="single" w:color="DDDDDD" w:sz="4"/>
-              <w:right w:val="single" w:color="DDDDDD" w:sz="4"/>
-            </w:tcBorders>
-            <w:tcMar>
-              <w:top w:type="dxa" w:w="60"/>
-              <w:left w:type="dxa" w:w="100"/>
-              <w:bottom w:type="dxa" w:w="60"/>
-              <w:right w:type="dxa" w:w="100"/>
-            </w:tcMar>
-          </w:tcPr>
-          <w:p>
-            <w:r>
-              <w:rPr>
-                <w:rFonts w:ascii="Georgia" w:cs="Georgia" w:eastAsia="Georgia" w:hAnsi="Georgia"/>
-                <w:b/>
-                <w:sz w:val="18"/>
-                <w:szCs w:val="18"/>
-              </w:rPr>
-              <w:t xml:space="preserve">CSNS</w:t>
-            </w:r>
-          </w:p>
-        </w:tc>
-        <w:tc>
-          <w:tcPr>
-            <w:tcW w:type="dxa" w:w="6600"/>
-            <w:tcBorders>
-              <w:top w:val="single" w:color="DDDDDD" w:sz="4"/>
-              <w:left w:val="single" w:color="DDDDDD" w:sz="4"/>
-              <w:bottom w:val="single" w:color="DDDDDD" w:sz="4"/>
-              <w:right w:val="single" w:color="DDDDDD" w:sz="4"/>
-            </w:tcBorders>
-            <w:tcMar>
-              <w:top w:type="dxa" w:w="60"/>
-              <w:left w:type="dxa" w:w="100"/>
-              <w:bottom w:type="dxa" w:w="60"/>
-              <w:right w:type="dxa" w:w="100"/>
-            </w:tcMar>
-          </w:tcPr>
-          <w:p>
-            <w:r>
-              <w:rPr>
-                <w:rFonts w:ascii="Georgia" w:cs="Georgia" w:eastAsia="Georgia" w:hAnsi="Georgia"/>
-                <w:sz w:val="18"/>
-                <w:szCs w:val="18"/>
-              </w:rPr>
-              <w:t xml:space="preserve">V. A. Clark, A Study of New Safaitic Inscriptions from Jordan (1979).</w:t>
-            </w:r>
-          </w:p>
-        </w:tc>
-      </w:tr>
-      <w:tr>
-        <w:tc>
-          <w:tcPr>
-            <w:tcW w:type="dxa" w:w="2400"/>
-            <w:tcBorders>
-              <w:top w:val="single" w:color="DDDDDD" w:sz="4"/>
-              <w:left w:val="single" w:color="DDDDDD" w:sz="4"/>
-              <w:bottom w:val="single" w:color="DDDDDD" w:sz="4"/>
-              <w:right w:val="single" w:color="DDDDDD" w:sz="4"/>
-            </w:tcBorders>
-            <w:tcMar>
-              <w:top w:type="dxa" w:w="60"/>
-              <w:left w:type="dxa" w:w="100"/>
-              <w:bottom w:type="dxa" w:w="60"/>
-              <w:right w:type="dxa" w:w="100"/>
-            </w:tcMar>
-          </w:tcPr>
-          <w:p>
-            <w:r>
-              <w:rPr>
-                <w:rFonts w:ascii="Georgia" w:cs="Georgia" w:eastAsia="Georgia" w:hAnsi="Georgia"/>
-                <w:b/>
-                <w:sz w:val="18"/>
-                <w:szCs w:val="18"/>
-              </w:rPr>
               <w:t xml:space="preserve">Rees</w:t>
             </w:r>
           </w:p>
@@ -8396,63 +8383,6 @@
                 <w:szCs w:val="18"/>
               </w:rPr>
               <w:t xml:space="preserve">L. W. B. Rees, frühe Aufnahmen aus der Ḥarrat al-Raǧil (1920er).</w:t>
-            </w:r>
-          </w:p>
-        </w:tc>
-      </w:tr>
-      <w:tr>
-        <w:tc>
-          <w:tcPr>
-            <w:tcW w:type="dxa" w:w="2400"/>
-            <w:tcBorders>
-              <w:top w:val="single" w:color="DDDDDD" w:sz="4"/>
-              <w:left w:val="single" w:color="DDDDDD" w:sz="4"/>
-              <w:bottom w:val="single" w:color="DDDDDD" w:sz="4"/>
-              <w:right w:val="single" w:color="DDDDDD" w:sz="4"/>
-            </w:tcBorders>
-            <w:tcMar>
-              <w:top w:type="dxa" w:w="60"/>
-              <w:left w:type="dxa" w:w="100"/>
-              <w:bottom w:type="dxa" w:w="60"/>
-              <w:right w:type="dxa" w:w="100"/>
-            </w:tcMar>
-          </w:tcPr>
-          <w:p>
-            <w:r>
-              <w:rPr>
-                <w:rFonts w:ascii="Georgia" w:cs="Georgia" w:eastAsia="Georgia" w:hAnsi="Georgia"/>
-                <w:b/>
-                <w:sz w:val="18"/>
-                <w:szCs w:val="18"/>
-              </w:rPr>
-              <w:t xml:space="preserve">Is.L / Is.Mu</w:t>
-            </w:r>
-          </w:p>
-        </w:tc>
-        <w:tc>
-          <w:tcPr>
-            <w:tcW w:type="dxa" w:w="6600"/>
-            <w:tcBorders>
-              <w:top w:val="single" w:color="DDDDDD" w:sz="4"/>
-              <w:left w:val="single" w:color="DDDDDD" w:sz="4"/>
-              <w:bottom w:val="single" w:color="DDDDDD" w:sz="4"/>
-              <w:right w:val="single" w:color="DDDDDD" w:sz="4"/>
-            </w:tcBorders>
-            <w:tcMar>
-              <w:top w:type="dxa" w:w="60"/>
-              <w:left w:type="dxa" w:w="100"/>
-              <w:bottom w:type="dxa" w:w="60"/>
-              <w:right w:type="dxa" w:w="100"/>
-            </w:tcMar>
-          </w:tcPr>
-          <w:p>
-            <w:r>
-              <w:rPr>
-                <w:rFonts w:ascii="Georgia" w:cs="Georgia" w:eastAsia="Georgia" w:hAnsi="Georgia"/>
-                <w:sz w:val="18"/>
-                <w:szCs w:val="18"/>
-              </w:rPr>
-              <w:t xml:space="preserve">Sammlungen aus al-ʿĪsāwī (Rif Dimašq); Nachweis im OCIANA-Eintrag.</w:t>
             </w:r>
           </w:p>
         </w:tc>
@@ -8596,7 +8526,7 @@
                 <w:sz w:val="18"/>
                 <w:szCs w:val="18"/>
               </w:rPr>
-              <w:t xml:space="preserve">AbaNS / HaNSB / HaNS / HNSD / HSNS</w:t>
+              <w:t xml:space="preserve">SIJ</w:t>
             </w:r>
           </w:p>
         </w:tc>
@@ -8623,7 +8553,7 @@
                 <w:sz w:val="18"/>
                 <w:szCs w:val="18"/>
               </w:rPr>
-              <w:t xml:space="preserve">nordjordanische Safaitic-Surveys; OCIANA.</w:t>
+              <w:t xml:space="preserve">F. V. Winnett, Safaitic Inscriptions from Jordan (Toronto 1957).</w:t>
             </w:r>
           </w:p>
         </w:tc>
@@ -8653,7 +8583,7 @@
                 <w:sz w:val="18"/>
                 <w:szCs w:val="18"/>
               </w:rPr>
-              <w:t xml:space="preserve">JaS / KWQ / CEDS / GSSH / MKJS / BS / HYGQ / WAMS / RVP / BWM / ASFF / ZN</w:t>
+              <w:t xml:space="preserve">WH</w:t>
             </w:r>
           </w:p>
         </w:tc>
@@ -8680,7 +8610,7 @@
                 <w:sz w:val="18"/>
                 <w:szCs w:val="18"/>
               </w:rPr>
-              <w:t xml:space="preserve">weitere OCIANA-Survey-Siglen; vollständiger Editionsnachweis jeweils im OCIANA-Eintrag.</w:t>
+              <w:t xml:space="preserve">F. V. Winnett &amp; G. L. Harding, Inscriptions from Fifty Safaitic Cairns (Toronto 1978).</w:t>
             </w:r>
           </w:p>
         </w:tc>
@@ -8699,19 +8629,6 @@
           <w:szCs w:val="24"/>
         </w:rPr>
         <w:t xml:space="preserve">Die Fundorte</w:t>
-      </w:r>
-    </w:p>
-    <w:p>
-      <w:pPr>
-        <w:spacing w:after="200" w:line="320"/>
-      </w:pPr>
-      <w:r>
-        <w:rPr>
-          <w:rFonts w:ascii="Georgia" w:cs="Georgia" w:eastAsia="Georgia" w:hAnsi="Georgia"/>
-          <w:sz w:val="22"/>
-          <w:szCs w:val="22"/>
-        </w:rPr>
-        <w:t xml:space="preserve">Der Fundort ist normalisiert (spezifischster benannter Ort); zwei Zonen ordnen: die nordostjordanische Ḥarrah und die südsyrische Ṣafā.</w:t>
       </w:r>
     </w:p>
     <w:tbl>
@@ -8730,6 +8647,234 @@
         <w:gridCol w:w="2400"/>
         <w:gridCol w:w="6600"/>
       </w:tblGrid>
+      <w:tr>
+        <w:tc>
+          <w:tcPr>
+            <w:tcW w:type="dxa" w:w="2400"/>
+            <w:tcBorders>
+              <w:top w:val="single" w:color="DDDDDD" w:sz="4"/>
+              <w:left w:val="single" w:color="DDDDDD" w:sz="4"/>
+              <w:bottom w:val="single" w:color="DDDDDD" w:sz="4"/>
+              <w:right w:val="single" w:color="DDDDDD" w:sz="4"/>
+            </w:tcBorders>
+            <w:tcMar>
+              <w:top w:type="dxa" w:w="60"/>
+              <w:left w:type="dxa" w:w="100"/>
+              <w:bottom w:type="dxa" w:w="60"/>
+              <w:right w:type="dxa" w:w="100"/>
+            </w:tcMar>
+          </w:tcPr>
+          <w:p>
+            <w:r>
+              <w:rPr>
+                <w:rFonts w:ascii="Georgia" w:cs="Georgia" w:eastAsia="Georgia" w:hAnsi="Georgia"/>
+                <w:b/>
+                <w:sz w:val="18"/>
+                <w:szCs w:val="18"/>
+              </w:rPr>
+              <w:t xml:space="preserve">al-ʿĪsāwī</w:t>
+            </w:r>
+          </w:p>
+        </w:tc>
+        <w:tc>
+          <w:tcPr>
+            <w:tcW w:type="dxa" w:w="6600"/>
+            <w:tcBorders>
+              <w:top w:val="single" w:color="DDDDDD" w:sz="4"/>
+              <w:left w:val="single" w:color="DDDDDD" w:sz="4"/>
+              <w:bottom w:val="single" w:color="DDDDDD" w:sz="4"/>
+              <w:right w:val="single" w:color="DDDDDD" w:sz="4"/>
+            </w:tcBorders>
+            <w:tcMar>
+              <w:top w:type="dxa" w:w="60"/>
+              <w:left w:type="dxa" w:w="100"/>
+              <w:bottom w:type="dxa" w:w="60"/>
+              <w:right w:type="dxa" w:w="100"/>
+            </w:tcMar>
+          </w:tcPr>
+          <w:p>
+            <w:r>
+              <w:rPr>
+                <w:rFonts w:ascii="Georgia" w:cs="Georgia" w:eastAsia="Georgia" w:hAnsi="Georgia"/>
+                <w:sz w:val="18"/>
+                <w:szCs w:val="18"/>
+              </w:rPr>
+              <w:t xml:space="preserve">al-ʿĪsāwī, Rif Dimašq, südsyrische Ṣafā.</w:t>
+            </w:r>
+          </w:p>
+        </w:tc>
+      </w:tr>
+      <w:tr>
+        <w:tc>
+          <w:tcPr>
+            <w:tcW w:type="dxa" w:w="2400"/>
+            <w:tcBorders>
+              <w:top w:val="single" w:color="DDDDDD" w:sz="4"/>
+              <w:left w:val="single" w:color="DDDDDD" w:sz="4"/>
+              <w:bottom w:val="single" w:color="DDDDDD" w:sz="4"/>
+              <w:right w:val="single" w:color="DDDDDD" w:sz="4"/>
+            </w:tcBorders>
+            <w:tcMar>
+              <w:top w:type="dxa" w:w="60"/>
+              <w:left w:type="dxa" w:w="100"/>
+              <w:bottom w:type="dxa" w:w="60"/>
+              <w:right w:type="dxa" w:w="100"/>
+            </w:tcMar>
+          </w:tcPr>
+          <w:p>
+            <w:r>
+              <w:rPr>
+                <w:rFonts w:ascii="Georgia" w:cs="Georgia" w:eastAsia="Georgia" w:hAnsi="Georgia"/>
+                <w:b/>
+                <w:sz w:val="18"/>
+                <w:szCs w:val="18"/>
+              </w:rPr>
+              <w:t xml:space="preserve">Al-Mafraq</w:t>
+            </w:r>
+          </w:p>
+        </w:tc>
+        <w:tc>
+          <w:tcPr>
+            <w:tcW w:type="dxa" w:w="6600"/>
+            <w:tcBorders>
+              <w:top w:val="single" w:color="DDDDDD" w:sz="4"/>
+              <w:left w:val="single" w:color="DDDDDD" w:sz="4"/>
+              <w:bottom w:val="single" w:color="DDDDDD" w:sz="4"/>
+              <w:right w:val="single" w:color="DDDDDD" w:sz="4"/>
+            </w:tcBorders>
+            <w:tcMar>
+              <w:top w:type="dxa" w:w="60"/>
+              <w:left w:type="dxa" w:w="100"/>
+              <w:bottom w:type="dxa" w:w="60"/>
+              <w:right w:type="dxa" w:w="100"/>
+            </w:tcMar>
+          </w:tcPr>
+          <w:p>
+            <w:r>
+              <w:rPr>
+                <w:rFonts w:ascii="Georgia" w:cs="Georgia" w:eastAsia="Georgia" w:hAnsi="Georgia"/>
+                <w:sz w:val="18"/>
+                <w:szCs w:val="18"/>
+              </w:rPr>
+              <w:t xml:space="preserve">Provinz Al-Mafraq (NO-Jordanien) — genauer Fundpunkt nicht angegeben.</w:t>
+            </w:r>
+          </w:p>
+        </w:tc>
+      </w:tr>
+      <w:tr>
+        <w:tc>
+          <w:tcPr>
+            <w:tcW w:type="dxa" w:w="2400"/>
+            <w:tcBorders>
+              <w:top w:val="single" w:color="DDDDDD" w:sz="4"/>
+              <w:left w:val="single" w:color="DDDDDD" w:sz="4"/>
+              <w:bottom w:val="single" w:color="DDDDDD" w:sz="4"/>
+              <w:right w:val="single" w:color="DDDDDD" w:sz="4"/>
+            </w:tcBorders>
+            <w:tcMar>
+              <w:top w:type="dxa" w:w="60"/>
+              <w:left w:type="dxa" w:w="100"/>
+              <w:bottom w:type="dxa" w:w="60"/>
+              <w:right w:type="dxa" w:w="100"/>
+            </w:tcMar>
+          </w:tcPr>
+          <w:p>
+            <w:r>
+              <w:rPr>
+                <w:rFonts w:ascii="Georgia" w:cs="Georgia" w:eastAsia="Georgia" w:hAnsi="Georgia"/>
+                <w:b/>
+                <w:sz w:val="18"/>
+                <w:szCs w:val="18"/>
+              </w:rPr>
+              <w:t xml:space="preserve">Fundort unbekannt</w:t>
+            </w:r>
+          </w:p>
+        </w:tc>
+        <w:tc>
+          <w:tcPr>
+            <w:tcW w:type="dxa" w:w="6600"/>
+            <w:tcBorders>
+              <w:top w:val="single" w:color="DDDDDD" w:sz="4"/>
+              <w:left w:val="single" w:color="DDDDDD" w:sz="4"/>
+              <w:bottom w:val="single" w:color="DDDDDD" w:sz="4"/>
+              <w:right w:val="single" w:color="DDDDDD" w:sz="4"/>
+            </w:tcBorders>
+            <w:tcMar>
+              <w:top w:type="dxa" w:w="60"/>
+              <w:left w:type="dxa" w:w="100"/>
+              <w:bottom w:type="dxa" w:w="60"/>
+              <w:right w:type="dxa" w:w="100"/>
+            </w:tcMar>
+          </w:tcPr>
+          <w:p>
+            <w:r>
+              <w:rPr>
+                <w:rFonts w:ascii="Georgia" w:cs="Georgia" w:eastAsia="Georgia" w:hAnsi="Georgia"/>
+                <w:sz w:val="18"/>
+                <w:szCs w:val="18"/>
+              </w:rPr>
+              <w:t xml:space="preserve">keine Ortsangabe im OCIANA-Eintrag.</w:t>
+            </w:r>
+          </w:p>
+        </w:tc>
+      </w:tr>
+      <w:tr>
+        <w:tc>
+          <w:tcPr>
+            <w:tcW w:type="dxa" w:w="2400"/>
+            <w:tcBorders>
+              <w:top w:val="single" w:color="DDDDDD" w:sz="4"/>
+              <w:left w:val="single" w:color="DDDDDD" w:sz="4"/>
+              <w:bottom w:val="single" w:color="DDDDDD" w:sz="4"/>
+              <w:right w:val="single" w:color="DDDDDD" w:sz="4"/>
+            </w:tcBorders>
+            <w:tcMar>
+              <w:top w:type="dxa" w:w="60"/>
+              <w:left w:type="dxa" w:w="100"/>
+              <w:bottom w:type="dxa" w:w="60"/>
+              <w:right w:type="dxa" w:w="100"/>
+            </w:tcMar>
+          </w:tcPr>
+          <w:p>
+            <w:r>
+              <w:rPr>
+                <w:rFonts w:ascii="Georgia" w:cs="Georgia" w:eastAsia="Georgia" w:hAnsi="Georgia"/>
+                <w:b/>
+                <w:sz w:val="18"/>
+                <w:szCs w:val="18"/>
+              </w:rPr>
+              <w:t xml:space="preserve">Ǧabal Says</w:t>
+            </w:r>
+          </w:p>
+        </w:tc>
+        <w:tc>
+          <w:tcPr>
+            <w:tcW w:type="dxa" w:w="6600"/>
+            <w:tcBorders>
+              <w:top w:val="single" w:color="DDDDDD" w:sz="4"/>
+              <w:left w:val="single" w:color="DDDDDD" w:sz="4"/>
+              <w:bottom w:val="single" w:color="DDDDDD" w:sz="4"/>
+              <w:right w:val="single" w:color="DDDDDD" w:sz="4"/>
+            </w:tcBorders>
+            <w:tcMar>
+              <w:top w:type="dxa" w:w="60"/>
+              <w:left w:type="dxa" w:w="100"/>
+              <w:bottom w:type="dxa" w:w="60"/>
+              <w:right w:type="dxa" w:w="100"/>
+            </w:tcMar>
+          </w:tcPr>
+          <w:p>
+            <w:r>
+              <w:rPr>
+                <w:rFonts w:ascii="Georgia" w:cs="Georgia" w:eastAsia="Georgia" w:hAnsi="Georgia"/>
+                <w:sz w:val="18"/>
+                <w:szCs w:val="18"/>
+              </w:rPr>
+              <w:t xml:space="preserve">Ǧabal Says (Basaltmassiv), Rif Dimašq, Süd-Syrien.</w:t>
+            </w:r>
+          </w:p>
+        </w:tc>
+      </w:tr>
       <w:tr>
         <w:tc>
           <w:tcPr>
@@ -8783,177 +8928,6 @@
                 <w:szCs w:val="18"/>
               </w:rPr>
               <w:t xml:space="preserve">Steinhügel (Cairn) des Ḥāniʾ, NO-jordanische Ḥarrah; 1953 von Harding ergraben (Sammlung HCH).</w:t>
-            </w:r>
-          </w:p>
-        </w:tc>
-      </w:tr>
-      <w:tr>
-        <w:tc>
-          <w:tcPr>
-            <w:tcW w:type="dxa" w:w="2400"/>
-            <w:tcBorders>
-              <w:top w:val="single" w:color="DDDDDD" w:sz="4"/>
-              <w:left w:val="single" w:color="DDDDDD" w:sz="4"/>
-              <w:bottom w:val="single" w:color="DDDDDD" w:sz="4"/>
-              <w:right w:val="single" w:color="DDDDDD" w:sz="4"/>
-            </w:tcBorders>
-            <w:tcMar>
-              <w:top w:type="dxa" w:w="60"/>
-              <w:left w:type="dxa" w:w="100"/>
-              <w:bottom w:type="dxa" w:w="60"/>
-              <w:right w:type="dxa" w:w="100"/>
-            </w:tcMar>
-          </w:tcPr>
-          <w:p>
-            <w:r>
-              <w:rPr>
-                <w:rFonts w:ascii="Georgia" w:cs="Georgia" w:eastAsia="Georgia" w:hAnsi="Georgia"/>
-                <w:b/>
-                <w:sz w:val="18"/>
-                <w:szCs w:val="18"/>
-              </w:rPr>
-              <w:t xml:space="preserve">Km 612</w:t>
-            </w:r>
-          </w:p>
-        </w:tc>
-        <w:tc>
-          <w:tcPr>
-            <w:tcW w:type="dxa" w:w="6600"/>
-            <w:tcBorders>
-              <w:top w:val="single" w:color="DDDDDD" w:sz="4"/>
-              <w:left w:val="single" w:color="DDDDDD" w:sz="4"/>
-              <w:bottom w:val="single" w:color="DDDDDD" w:sz="4"/>
-              <w:right w:val="single" w:color="DDDDDD" w:sz="4"/>
-            </w:tcBorders>
-            <w:tcMar>
-              <w:top w:type="dxa" w:w="60"/>
-              <w:left w:type="dxa" w:w="100"/>
-              <w:bottom w:type="dxa" w:w="60"/>
-              <w:right w:type="dxa" w:w="100"/>
-            </w:tcMar>
-          </w:tcPr>
-          <w:p>
-            <w:r>
-              <w:rPr>
-                <w:rFonts w:ascii="Georgia" w:cs="Georgia" w:eastAsia="Georgia" w:hAnsi="Georgia"/>
-                <w:sz w:val="18"/>
-                <w:szCs w:val="18"/>
-              </w:rPr>
-              <w:t xml:space="preserve">Kilometerstein 612 (≈ 32 km westl. Badana) an der Pipeline-Piste — Survey-Fundpunkt, NO-Jordanien.</w:t>
-            </w:r>
-          </w:p>
-        </w:tc>
-      </w:tr>
-      <w:tr>
-        <w:tc>
-          <w:tcPr>
-            <w:tcW w:type="dxa" w:w="2400"/>
-            <w:tcBorders>
-              <w:top w:val="single" w:color="DDDDDD" w:sz="4"/>
-              <w:left w:val="single" w:color="DDDDDD" w:sz="4"/>
-              <w:bottom w:val="single" w:color="DDDDDD" w:sz="4"/>
-              <w:right w:val="single" w:color="DDDDDD" w:sz="4"/>
-            </w:tcBorders>
-            <w:tcMar>
-              <w:top w:type="dxa" w:w="60"/>
-              <w:left w:type="dxa" w:w="100"/>
-              <w:bottom w:type="dxa" w:w="60"/>
-              <w:right w:type="dxa" w:w="100"/>
-            </w:tcMar>
-          </w:tcPr>
-          <w:p>
-            <w:r>
-              <w:rPr>
-                <w:rFonts w:ascii="Georgia" w:cs="Georgia" w:eastAsia="Georgia" w:hAnsi="Georgia"/>
-                <w:b/>
-                <w:sz w:val="18"/>
-                <w:szCs w:val="18"/>
-              </w:rPr>
-              <w:t xml:space="preserve">Wādī Salma</w:t>
-            </w:r>
-          </w:p>
-        </w:tc>
-        <w:tc>
-          <w:tcPr>
-            <w:tcW w:type="dxa" w:w="6600"/>
-            <w:tcBorders>
-              <w:top w:val="single" w:color="DDDDDD" w:sz="4"/>
-              <w:left w:val="single" w:color="DDDDDD" w:sz="4"/>
-              <w:bottom w:val="single" w:color="DDDDDD" w:sz="4"/>
-              <w:right w:val="single" w:color="DDDDDD" w:sz="4"/>
-            </w:tcBorders>
-            <w:tcMar>
-              <w:top w:type="dxa" w:w="60"/>
-              <w:left w:type="dxa" w:w="100"/>
-              <w:bottom w:type="dxa" w:w="60"/>
-              <w:right w:type="dxa" w:w="100"/>
-            </w:tcMar>
-          </w:tcPr>
-          <w:p>
-            <w:r>
-              <w:rPr>
-                <w:rFonts w:ascii="Georgia" w:cs="Georgia" w:eastAsia="Georgia" w:hAnsi="Georgia"/>
-                <w:sz w:val="18"/>
-                <w:szCs w:val="18"/>
-              </w:rPr>
-              <w:t xml:space="preserve">Wādī Salma, Provinz Al-Mafraq, NO-Jordanien.</w:t>
-            </w:r>
-          </w:p>
-        </w:tc>
-      </w:tr>
-      <w:tr>
-        <w:tc>
-          <w:tcPr>
-            <w:tcW w:type="dxa" w:w="2400"/>
-            <w:tcBorders>
-              <w:top w:val="single" w:color="DDDDDD" w:sz="4"/>
-              <w:left w:val="single" w:color="DDDDDD" w:sz="4"/>
-              <w:bottom w:val="single" w:color="DDDDDD" w:sz="4"/>
-              <w:right w:val="single" w:color="DDDDDD" w:sz="4"/>
-            </w:tcBorders>
-            <w:tcMar>
-              <w:top w:type="dxa" w:w="60"/>
-              <w:left w:type="dxa" w:w="100"/>
-              <w:bottom w:type="dxa" w:w="60"/>
-              <w:right w:type="dxa" w:w="100"/>
-            </w:tcMar>
-          </w:tcPr>
-          <w:p>
-            <w:r>
-              <w:rPr>
-                <w:rFonts w:ascii="Georgia" w:cs="Georgia" w:eastAsia="Georgia" w:hAnsi="Georgia"/>
-                <w:b/>
-                <w:sz w:val="18"/>
-                <w:szCs w:val="18"/>
-              </w:rPr>
-              <w:t xml:space="preserve">Wādī Sārah</w:t>
-            </w:r>
-          </w:p>
-        </w:tc>
-        <w:tc>
-          <w:tcPr>
-            <w:tcW w:type="dxa" w:w="6600"/>
-            <w:tcBorders>
-              <w:top w:val="single" w:color="DDDDDD" w:sz="4"/>
-              <w:left w:val="single" w:color="DDDDDD" w:sz="4"/>
-              <w:bottom w:val="single" w:color="DDDDDD" w:sz="4"/>
-              <w:right w:val="single" w:color="DDDDDD" w:sz="4"/>
-            </w:tcBorders>
-            <w:tcMar>
-              <w:top w:type="dxa" w:w="60"/>
-              <w:left w:type="dxa" w:w="100"/>
-              <w:bottom w:type="dxa" w:w="60"/>
-              <w:right w:type="dxa" w:w="100"/>
-            </w:tcMar>
-          </w:tcPr>
-          <w:p>
-            <w:r>
-              <w:rPr>
-                <w:rFonts w:ascii="Georgia" w:cs="Georgia" w:eastAsia="Georgia" w:hAnsi="Georgia"/>
-                <w:sz w:val="18"/>
-                <w:szCs w:val="18"/>
-              </w:rPr>
-              <w:t xml:space="preserve">Wādī Sārah, Provinz Al-Mafraq, NO-Jordanien.</w:t>
             </w:r>
           </w:p>
         </w:tc>
@@ -9154,7 +9128,7 @@
                 <w:sz w:val="18"/>
                 <w:szCs w:val="18"/>
               </w:rPr>
-              <w:t xml:space="preserve">Zalaf</w:t>
+              <w:t xml:space="preserve">Jordanien / Syrien (allg.)</w:t>
             </w:r>
           </w:p>
         </w:tc>
@@ -9181,7 +9155,7 @@
                 <w:sz w:val="18"/>
                 <w:szCs w:val="18"/>
               </w:rPr>
-              <w:t xml:space="preserve">Gegend um Zalaf am Wādī al-Shām, südsyrische Ṣafā.</w:t>
+              <w:t xml:space="preserve">nur das Land überliefert (Ḥarrah bzw. Ṣafā).</w:t>
             </w:r>
           </w:p>
         </w:tc>
@@ -9211,7 +9185,7 @@
                 <w:sz w:val="18"/>
                 <w:szCs w:val="18"/>
               </w:rPr>
-              <w:t xml:space="preserve">al-ʿĪsāwī</w:t>
+              <w:t xml:space="preserve">Khirbat al-Hubayrīyah / al-Umbāšī / Al-Mrōshan</w:t>
             </w:r>
           </w:p>
         </w:tc>
@@ -9238,7 +9212,121 @@
                 <w:sz w:val="18"/>
                 <w:szCs w:val="18"/>
               </w:rPr>
-              <w:t xml:space="preserve">al-ʿĪsāwī, Rif Dimašq, südsyrische Ṣafā.</w:t>
+              <w:t xml:space="preserve">Fundpunkte in Al-Suwaydā, Süd-Syrien.</w:t>
+            </w:r>
+          </w:p>
+        </w:tc>
+      </w:tr>
+      <w:tr>
+        <w:tc>
+          <w:tcPr>
+            <w:tcW w:type="dxa" w:w="2400"/>
+            <w:tcBorders>
+              <w:top w:val="single" w:color="DDDDDD" w:sz="4"/>
+              <w:left w:val="single" w:color="DDDDDD" w:sz="4"/>
+              <w:bottom w:val="single" w:color="DDDDDD" w:sz="4"/>
+              <w:right w:val="single" w:color="DDDDDD" w:sz="4"/>
+            </w:tcBorders>
+            <w:tcMar>
+              <w:top w:type="dxa" w:w="60"/>
+              <w:left w:type="dxa" w:w="100"/>
+              <w:bottom w:type="dxa" w:w="60"/>
+              <w:right w:type="dxa" w:w="100"/>
+            </w:tcMar>
+          </w:tcPr>
+          <w:p>
+            <w:r>
+              <w:rPr>
+                <w:rFonts w:ascii="Georgia" w:cs="Georgia" w:eastAsia="Georgia" w:hAnsi="Georgia"/>
+                <w:b/>
+                <w:sz w:val="18"/>
+                <w:szCs w:val="18"/>
+              </w:rPr>
+              <w:t xml:space="preserve">Km 612</w:t>
+            </w:r>
+          </w:p>
+        </w:tc>
+        <w:tc>
+          <w:tcPr>
+            <w:tcW w:type="dxa" w:w="6600"/>
+            <w:tcBorders>
+              <w:top w:val="single" w:color="DDDDDD" w:sz="4"/>
+              <w:left w:val="single" w:color="DDDDDD" w:sz="4"/>
+              <w:bottom w:val="single" w:color="DDDDDD" w:sz="4"/>
+              <w:right w:val="single" w:color="DDDDDD" w:sz="4"/>
+            </w:tcBorders>
+            <w:tcMar>
+              <w:top w:type="dxa" w:w="60"/>
+              <w:left w:type="dxa" w:w="100"/>
+              <w:bottom w:type="dxa" w:w="60"/>
+              <w:right w:type="dxa" w:w="100"/>
+            </w:tcMar>
+          </w:tcPr>
+          <w:p>
+            <w:r>
+              <w:rPr>
+                <w:rFonts w:ascii="Georgia" w:cs="Georgia" w:eastAsia="Georgia" w:hAnsi="Georgia"/>
+                <w:sz w:val="18"/>
+                <w:szCs w:val="18"/>
+              </w:rPr>
+              <w:t xml:space="preserve">Kilometerstein 612 (≈ 32 km westl. Badana) an der Pipeline-Piste — Survey-Fundpunkt, NO-Jordanien.</w:t>
+            </w:r>
+          </w:p>
+        </w:tc>
+      </w:tr>
+      <w:tr>
+        <w:tc>
+          <w:tcPr>
+            <w:tcW w:type="dxa" w:w="2400"/>
+            <w:tcBorders>
+              <w:top w:val="single" w:color="DDDDDD" w:sz="4"/>
+              <w:left w:val="single" w:color="DDDDDD" w:sz="4"/>
+              <w:bottom w:val="single" w:color="DDDDDD" w:sz="4"/>
+              <w:right w:val="single" w:color="DDDDDD" w:sz="4"/>
+            </w:tcBorders>
+            <w:tcMar>
+              <w:top w:type="dxa" w:w="60"/>
+              <w:left w:type="dxa" w:w="100"/>
+              <w:bottom w:type="dxa" w:w="60"/>
+              <w:right w:type="dxa" w:w="100"/>
+            </w:tcMar>
+          </w:tcPr>
+          <w:p>
+            <w:r>
+              <w:rPr>
+                <w:rFonts w:ascii="Georgia" w:cs="Georgia" w:eastAsia="Georgia" w:hAnsi="Georgia"/>
+                <w:b/>
+                <w:sz w:val="18"/>
+                <w:szCs w:val="18"/>
+              </w:rPr>
+              <w:t xml:space="preserve">Rif Dimašq / Al-Suwaydā</w:t>
+            </w:r>
+          </w:p>
+        </w:tc>
+        <w:tc>
+          <w:tcPr>
+            <w:tcW w:type="dxa" w:w="6600"/>
+            <w:tcBorders>
+              <w:top w:val="single" w:color="DDDDDD" w:sz="4"/>
+              <w:left w:val="single" w:color="DDDDDD" w:sz="4"/>
+              <w:bottom w:val="single" w:color="DDDDDD" w:sz="4"/>
+              <w:right w:val="single" w:color="DDDDDD" w:sz="4"/>
+            </w:tcBorders>
+            <w:tcMar>
+              <w:top w:type="dxa" w:w="60"/>
+              <w:left w:type="dxa" w:w="100"/>
+              <w:bottom w:type="dxa" w:w="60"/>
+              <w:right w:type="dxa" w:w="100"/>
+            </w:tcMar>
+          </w:tcPr>
+          <w:p>
+            <w:r>
+              <w:rPr>
+                <w:rFonts w:ascii="Georgia" w:cs="Georgia" w:eastAsia="Georgia" w:hAnsi="Georgia"/>
+                <w:sz w:val="18"/>
+                <w:szCs w:val="18"/>
+              </w:rPr>
+              <w:t xml:space="preserve">südsyrische Provinzen — genauer Fundpunkt nicht angegeben.</w:t>
             </w:r>
           </w:p>
         </w:tc>
@@ -9325,7 +9413,7 @@
                 <w:sz w:val="18"/>
                 <w:szCs w:val="18"/>
               </w:rPr>
-              <w:t xml:space="preserve">Ǧabal Says</w:t>
+              <w:t xml:space="preserve">Site / Tell / EDS / Cairn / WH Cairn + Nr.</w:t>
             </w:r>
           </w:p>
         </w:tc>
@@ -9352,7 +9440,7 @@
                 <w:sz w:val="18"/>
                 <w:szCs w:val="18"/>
               </w:rPr>
-              <w:t xml:space="preserve">Ǧabal Says (Basaltmassiv), Rif Dimašq, Süd-Syrien.</w:t>
+              <w:t xml:space="preserve">interne Survey-Codes — Fundpunkt ohne benannten Ort.</w:t>
             </w:r>
           </w:p>
         </w:tc>
@@ -9439,7 +9527,7 @@
                 <w:sz w:val="18"/>
                 <w:szCs w:val="18"/>
               </w:rPr>
-              <w:t xml:space="preserve">Khirbat al-Hubayrīyah / al-Umbāšī / Al-Mrōshan</w:t>
+              <w:t xml:space="preserve">Wādī Salma</w:t>
             </w:r>
           </w:p>
         </w:tc>
@@ -9466,7 +9554,7 @@
                 <w:sz w:val="18"/>
                 <w:szCs w:val="18"/>
               </w:rPr>
-              <w:t xml:space="preserve">Fundpunkte in Al-Suwaydā, Süd-Syrien.</w:t>
+              <w:t xml:space="preserve">Wādī Salma, Provinz Al-Mafraq, NO-Jordanien.</w:t>
             </w:r>
           </w:p>
         </w:tc>
@@ -9496,7 +9584,7 @@
                 <w:sz w:val="18"/>
                 <w:szCs w:val="18"/>
               </w:rPr>
-              <w:t xml:space="preserve">Al-Mafraq</w:t>
+              <w:t xml:space="preserve">Wādī Sārah</w:t>
             </w:r>
           </w:p>
         </w:tc>
@@ -9523,7 +9611,7 @@
                 <w:sz w:val="18"/>
                 <w:szCs w:val="18"/>
               </w:rPr>
-              <w:t xml:space="preserve">Provinz Al-Mafraq (NO-Jordanien) — genauer Fundpunkt nicht angegeben.</w:t>
+              <w:t xml:space="preserve">Wādī Sārah, Provinz Al-Mafraq, NO-Jordanien.</w:t>
             </w:r>
           </w:p>
         </w:tc>
@@ -9553,7 +9641,7 @@
                 <w:sz w:val="18"/>
                 <w:szCs w:val="18"/>
               </w:rPr>
-              <w:t xml:space="preserve">Rif Dimašq / Al-Suwaydā</w:t>
+              <w:t xml:space="preserve">Zalaf</w:t>
             </w:r>
           </w:p>
         </w:tc>
@@ -9580,7 +9668,109 @@
                 <w:sz w:val="18"/>
                 <w:szCs w:val="18"/>
               </w:rPr>
-              <w:t xml:space="preserve">südsyrische Provinzen — genauer Fundpunkt nicht angegeben.</w:t>
+              <w:t xml:space="preserve">Gegend um Zalaf am Wādī al-Shām, südsyrische Ṣafā.</w:t>
+            </w:r>
+          </w:p>
+        </w:tc>
+      </w:tr>
+    </w:tbl>
+    <w:p/>
+    <w:p>
+      <w:pPr>
+        <w:spacing w:before="200" w:after="80"/>
+      </w:pPr>
+      <w:r>
+        <w:rPr>
+          <w:rFonts w:ascii="Georgia" w:cs="Georgia" w:eastAsia="Georgia" w:hAnsi="Georgia"/>
+          <w:b/>
+          <w:sz w:val="24"/>
+          <w:szCs w:val="24"/>
+        </w:rPr>
+        <w:t xml:space="preserve">Bildnachweis</w:t>
+      </w:r>
+    </w:p>
+    <w:p>
+      <w:pPr>
+        <w:spacing w:after="200" w:line="320"/>
+      </w:pPr>
+      <w:r>
+        <w:rPr>
+          <w:rFonts w:ascii="Georgia" w:cs="Georgia" w:eastAsia="Georgia" w:hAnsi="Georgia"/>
+          <w:sz w:val="22"/>
+          <w:szCs w:val="22"/>
+        </w:rPr>
+        <w:t xml:space="preserve">Sieben Steine tragen eine assoziierte Felszeichnung (OCIANA-Feld „Associated Drawings“); sie stehen als Abbildung neben der jeweiligen Nachdichtung. Alle Bilder: OCIANA (Online Corpus of the Inscriptions of Ancient North Arabia), krc.orient.ox.ac.uk — Wiedergabe für diese Arbeitsfassung; vor einer Veröffentlichung sind die Bildrechte zu klären.</w:t>
+      </w:r>
+    </w:p>
+    <w:tbl>
+      <w:tblPr>
+        <w:tblW w:type="dxa" w:w="9000"/>
+        <w:tblBorders>
+          <w:top w:val="single" w:color="DDDDDD" w:sz="4"/>
+          <w:left w:val="single" w:color="DDDDDD" w:sz="4"/>
+          <w:bottom w:val="single" w:color="DDDDDD" w:sz="4"/>
+          <w:right w:val="single" w:color="DDDDDD" w:sz="4"/>
+          <w:insideH w:val="single" w:color="DDDDDD" w:sz="4"/>
+          <w:insideV w:val="single" w:color="DDDDDD" w:sz="4"/>
+        </w:tblBorders>
+      </w:tblPr>
+      <w:tblGrid>
+        <w:gridCol w:w="2400"/>
+        <w:gridCol w:w="6600"/>
+      </w:tblGrid>
+      <w:tr>
+        <w:tc>
+          <w:tcPr>
+            <w:tcW w:type="dxa" w:w="2400"/>
+            <w:tcBorders>
+              <w:top w:val="single" w:color="DDDDDD" w:sz="4"/>
+              <w:left w:val="single" w:color="DDDDDD" w:sz="4"/>
+              <w:bottom w:val="single" w:color="DDDDDD" w:sz="4"/>
+              <w:right w:val="single" w:color="DDDDDD" w:sz="4"/>
+            </w:tcBorders>
+            <w:tcMar>
+              <w:top w:type="dxa" w:w="60"/>
+              <w:left w:type="dxa" w:w="100"/>
+              <w:bottom w:type="dxa" w:w="60"/>
+              <w:right w:type="dxa" w:w="100"/>
+            </w:tcMar>
+          </w:tcPr>
+          <w:p>
+            <w:r>
+              <w:rPr>
+                <w:rFonts w:ascii="Georgia" w:cs="Georgia" w:eastAsia="Georgia" w:hAnsi="Georgia"/>
+                <w:b/>
+                <w:sz w:val="18"/>
+                <w:szCs w:val="18"/>
+              </w:rPr>
+              <w:t xml:space="preserve">KRS 1341</w:t>
+            </w:r>
+          </w:p>
+        </w:tc>
+        <w:tc>
+          <w:tcPr>
+            <w:tcW w:type="dxa" w:w="6600"/>
+            <w:tcBorders>
+              <w:top w:val="single" w:color="DDDDDD" w:sz="4"/>
+              <w:left w:val="single" w:color="DDDDDD" w:sz="4"/>
+              <w:bottom w:val="single" w:color="DDDDDD" w:sz="4"/>
+              <w:right w:val="single" w:color="DDDDDD" w:sz="4"/>
+            </w:tcBorders>
+            <w:tcMar>
+              <w:top w:type="dxa" w:w="60"/>
+              <w:left w:type="dxa" w:w="100"/>
+              <w:bottom w:type="dxa" w:w="60"/>
+              <w:right w:type="dxa" w:w="100"/>
+            </w:tcMar>
+          </w:tcPr>
+          <w:p>
+            <w:r>
+              <w:rPr>
+                <w:rFonts w:ascii="Georgia" w:cs="Georgia" w:eastAsia="Georgia" w:hAnsi="Georgia"/>
+                <w:sz w:val="18"/>
+                <w:szCs w:val="18"/>
+              </w:rPr>
+              <w:t xml:space="preserve">Löwe · OCIANA im0015581 · Basalt Desert Rescue Survey (G. M. H. King, 1989)</w:t>
             </w:r>
           </w:p>
         </w:tc>
@@ -9610,7 +9800,7 @@
                 <w:sz w:val="18"/>
                 <w:szCs w:val="18"/>
               </w:rPr>
-              <w:t xml:space="preserve">Jordanien / Syrien (allg.)</w:t>
+              <w:t xml:space="preserve">HYGQ 24</w:t>
             </w:r>
           </w:p>
         </w:tc>
@@ -9637,7 +9827,7 @@
                 <w:sz w:val="18"/>
                 <w:szCs w:val="18"/>
               </w:rPr>
-              <w:t xml:space="preserve">nur das Land überliefert (Ḥarrah bzw. Ṣafā).</w:t>
+              <w:t xml:space="preserve">Löwe · OCIANA im0056364 · OCIANA-Survey (HYGQ)</w:t>
             </w:r>
           </w:p>
         </w:tc>
@@ -9667,7 +9857,7 @@
                 <w:sz w:val="18"/>
                 <w:szCs w:val="18"/>
               </w:rPr>
-              <w:t xml:space="preserve">Site / Tell / EDS / Cairn / WH Cairn + Nr.</w:t>
+              <w:t xml:space="preserve">KRS 3051</w:t>
             </w:r>
           </w:p>
         </w:tc>
@@ -9694,7 +9884,7 @@
                 <w:sz w:val="18"/>
                 <w:szCs w:val="18"/>
               </w:rPr>
-              <w:t xml:space="preserve">interne Survey-Codes — Fundpunkt ohne benannten Ort.</w:t>
+              <w:t xml:space="preserve">junge Kamelstute · OCIANA im0021957 · Basalt Desert Rescue Survey (G. M. H. King, 1989)</w:t>
             </w:r>
           </w:p>
         </w:tc>
@@ -9724,7 +9914,7 @@
                 <w:sz w:val="18"/>
                 <w:szCs w:val="18"/>
               </w:rPr>
-              <w:t xml:space="preserve">Fundort unbekannt</w:t>
+              <w:t xml:space="preserve">HCH 85</w:t>
             </w:r>
           </w:p>
         </w:tc>
@@ -9751,7 +9941,178 @@
                 <w:sz w:val="18"/>
                 <w:szCs w:val="18"/>
               </w:rPr>
-              <w:t xml:space="preserve">keine Ortsangabe im OCIANA-Eintrag.</w:t>
+              <w:t xml:space="preserve">zwei Zeichnungen · OCIANA im0038237 · G. L. Harding, The Cairn of Hāniʾ (1953)</w:t>
+            </w:r>
+          </w:p>
+        </w:tc>
+      </w:tr>
+      <w:tr>
+        <w:tc>
+          <w:tcPr>
+            <w:tcW w:type="dxa" w:w="2400"/>
+            <w:tcBorders>
+              <w:top w:val="single" w:color="DDDDDD" w:sz="4"/>
+              <w:left w:val="single" w:color="DDDDDD" w:sz="4"/>
+              <w:bottom w:val="single" w:color="DDDDDD" w:sz="4"/>
+              <w:right w:val="single" w:color="DDDDDD" w:sz="4"/>
+            </w:tcBorders>
+            <w:tcMar>
+              <w:top w:type="dxa" w:w="60"/>
+              <w:left w:type="dxa" w:w="100"/>
+              <w:bottom w:type="dxa" w:w="60"/>
+              <w:right w:type="dxa" w:w="100"/>
+            </w:tcMar>
+          </w:tcPr>
+          <w:p>
+            <w:r>
+              <w:rPr>
+                <w:rFonts w:ascii="Georgia" w:cs="Georgia" w:eastAsia="Georgia" w:hAnsi="Georgia"/>
+                <w:b/>
+                <w:sz w:val="18"/>
+                <w:szCs w:val="18"/>
+              </w:rPr>
+              <w:t xml:space="preserve">C 286</w:t>
+            </w:r>
+          </w:p>
+        </w:tc>
+        <w:tc>
+          <w:tcPr>
+            <w:tcW w:type="dxa" w:w="6600"/>
+            <w:tcBorders>
+              <w:top w:val="single" w:color="DDDDDD" w:sz="4"/>
+              <w:left w:val="single" w:color="DDDDDD" w:sz="4"/>
+              <w:bottom w:val="single" w:color="DDDDDD" w:sz="4"/>
+              <w:right w:val="single" w:color="DDDDDD" w:sz="4"/>
+            </w:tcBorders>
+            <w:tcMar>
+              <w:top w:type="dxa" w:w="60"/>
+              <w:left w:type="dxa" w:w="100"/>
+              <w:bottom w:type="dxa" w:w="60"/>
+              <w:right w:type="dxa" w:w="100"/>
+            </w:tcMar>
+          </w:tcPr>
+          <w:p>
+            <w:r>
+              <w:rPr>
+                <w:rFonts w:ascii="Georgia" w:cs="Georgia" w:eastAsia="Georgia" w:hAnsi="Georgia"/>
+                <w:sz w:val="18"/>
+                <w:szCs w:val="18"/>
+              </w:rPr>
+              <w:t xml:space="preserve">Göttin Rḍy / weibl. Figuren · OCIANA im0027384 · CIS V (Ryckmans 1950); Dunand 1339 a</w:t>
+            </w:r>
+          </w:p>
+        </w:tc>
+      </w:tr>
+      <w:tr>
+        <w:tc>
+          <w:tcPr>
+            <w:tcW w:type="dxa" w:w="2400"/>
+            <w:tcBorders>
+              <w:top w:val="single" w:color="DDDDDD" w:sz="4"/>
+              <w:left w:val="single" w:color="DDDDDD" w:sz="4"/>
+              <w:bottom w:val="single" w:color="DDDDDD" w:sz="4"/>
+              <w:right w:val="single" w:color="DDDDDD" w:sz="4"/>
+            </w:tcBorders>
+            <w:tcMar>
+              <w:top w:type="dxa" w:w="60"/>
+              <w:left w:type="dxa" w:w="100"/>
+              <w:bottom w:type="dxa" w:w="60"/>
+              <w:right w:type="dxa" w:w="100"/>
+            </w:tcMar>
+          </w:tcPr>
+          <w:p>
+            <w:r>
+              <w:rPr>
+                <w:rFonts w:ascii="Georgia" w:cs="Georgia" w:eastAsia="Georgia" w:hAnsi="Georgia"/>
+                <w:b/>
+                <w:sz w:val="18"/>
+                <w:szCs w:val="18"/>
+              </w:rPr>
+              <w:t xml:space="preserve">C 1658</w:t>
+            </w:r>
+          </w:p>
+        </w:tc>
+        <w:tc>
+          <w:tcPr>
+            <w:tcW w:type="dxa" w:w="6600"/>
+            <w:tcBorders>
+              <w:top w:val="single" w:color="DDDDDD" w:sz="4"/>
+              <w:left w:val="single" w:color="DDDDDD" w:sz="4"/>
+              <w:bottom w:val="single" w:color="DDDDDD" w:sz="4"/>
+              <w:right w:val="single" w:color="DDDDDD" w:sz="4"/>
+            </w:tcBorders>
+            <w:tcMar>
+              <w:top w:type="dxa" w:w="60"/>
+              <w:left w:type="dxa" w:w="100"/>
+              <w:bottom w:type="dxa" w:w="60"/>
+              <w:right w:type="dxa" w:w="100"/>
+            </w:tcMar>
+          </w:tcPr>
+          <w:p>
+            <w:r>
+              <w:rPr>
+                <w:rFonts w:ascii="Georgia" w:cs="Georgia" w:eastAsia="Georgia" w:hAnsi="Georgia"/>
+                <w:sz w:val="18"/>
+                <w:szCs w:val="18"/>
+              </w:rPr>
+              <w:t xml:space="preserve">zwei Kamele + Krieger · OCIANA im0028730 · CIS V (Ryckmans 1950); Dunand 388</w:t>
+            </w:r>
+          </w:p>
+        </w:tc>
+      </w:tr>
+      <w:tr>
+        <w:tc>
+          <w:tcPr>
+            <w:tcW w:type="dxa" w:w="2400"/>
+            <w:tcBorders>
+              <w:top w:val="single" w:color="DDDDDD" w:sz="4"/>
+              <w:left w:val="single" w:color="DDDDDD" w:sz="4"/>
+              <w:bottom w:val="single" w:color="DDDDDD" w:sz="4"/>
+              <w:right w:val="single" w:color="DDDDDD" w:sz="4"/>
+            </w:tcBorders>
+            <w:tcMar>
+              <w:top w:type="dxa" w:w="60"/>
+              <w:left w:type="dxa" w:w="100"/>
+              <w:bottom w:type="dxa" w:w="60"/>
+              <w:right w:type="dxa" w:w="100"/>
+            </w:tcMar>
+          </w:tcPr>
+          <w:p>
+            <w:r>
+              <w:rPr>
+                <w:rFonts w:ascii="Georgia" w:cs="Georgia" w:eastAsia="Georgia" w:hAnsi="Georgia"/>
+                <w:b/>
+                <w:sz w:val="18"/>
+                <w:szCs w:val="18"/>
+              </w:rPr>
+              <w:t xml:space="preserve">C 2670</w:t>
+            </w:r>
+          </w:p>
+        </w:tc>
+        <w:tc>
+          <w:tcPr>
+            <w:tcW w:type="dxa" w:w="6600"/>
+            <w:tcBorders>
+              <w:top w:val="single" w:color="DDDDDD" w:sz="4"/>
+              <w:left w:val="single" w:color="DDDDDD" w:sz="4"/>
+              <w:bottom w:val="single" w:color="DDDDDD" w:sz="4"/>
+              <w:right w:val="single" w:color="DDDDDD" w:sz="4"/>
+            </w:tcBorders>
+            <w:tcMar>
+              <w:top w:type="dxa" w:w="60"/>
+              <w:left w:type="dxa" w:w="100"/>
+              <w:bottom w:type="dxa" w:w="60"/>
+              <w:right w:type="dxa" w:w="100"/>
+            </w:tcMar>
+          </w:tcPr>
+          <w:p>
+            <w:r>
+              <w:rPr>
+                <w:rFonts w:ascii="Georgia" w:cs="Georgia" w:eastAsia="Georgia" w:hAnsi="Georgia"/>
+                <w:sz w:val="18"/>
+                <w:szCs w:val="18"/>
+              </w:rPr>
+              <w:t xml:space="preserve">Oryx · OCIANA im0029738 · CIS V (Ryckmans 1950); Dunand 207 a; SESP</w:t>
             </w:r>
           </w:p>
         </w:tc>

</xml_diff>